<commit_message>
Expand deploy steps: GitHub Pages walkthrough + Namecheap/Cloudflare domain guide
Website: adds steps 6-9 (GitHub account, file upload, Pages enable,
custom domain) with a styled divider separating setup from deploy.

Docx: fully rewritten as a 5-part guide —
  Part 1: Claude Code setup (5 steps)
  Part 2: Build a website (5 steps)
  Part 3: Deploy on GitHub Pages (step-by-step A1-A7)
  Part 4: Buy a domain on Namecheap (N1-N5) or Cloudflare (C1-C4)
    with exact DNS A records and CNAME for GitHub Pages
  Part 5: Extras — Formspree contact form + Google Analytics

https://claude.ai/code/session_01L5z7WMZh8k8VyzM8mzwoBr
</commit_message>
<xml_diff>
--- a/Claude_Code_Guide.docx
+++ b/Claude_Code_Guide.docx
@@ -4,19 +4,29 @@
   <w:body>
     <w:p>
       <w:pPr>
+        <w:spacing w:before="0" w:after="0"/>
         <w:jc w:val="center"/>
         <w:shd w:val="clear" w:color="auto" w:fill="1B3A6B"/>
       </w:pPr>
       <w:r>
         <w:rPr>
           <w:b/>
+          <w:i w:val="0"/>
           <w:color w:val="FFFFFF"/>
-          <w:sz w:val="36"/>
+          <w:sz w:val="40"/>
         </w:rPr>
         <w:br/>
         <w:t xml:space="preserve">  Getting Started with Claude Code</w:t>
         <w:br/>
-        <w:t xml:space="preserve">  A Complete Guide: Setup · Build · Deploy</w:t>
+      </w:r>
+      <w:r>
+        <w:rPr>
+          <w:b w:val="0"/>
+          <w:i w:val="0"/>
+          <w:color w:val="B3C5E0"/>
+          <w:sz w:val="22"/>
+        </w:rPr>
+        <w:t xml:space="preserve">  A Complete Guide: Setup · Build a Website · Deploy on GitHub · Buy a Domain</w:t>
         <w:br/>
         <w:t xml:space="preserve"> </w:t>
       </w:r>
@@ -29,7 +39,7 @@
       <w:r>
         <w:rPr>
           <w:b w:val="0"/>
-          <w:i w:val="0"/>
+          <w:i/>
           <w:color w:val="6B7280"/>
           <w:sz w:val="18"/>
         </w:rPr>
@@ -38,24 +48,25 @@
     </w:p>
     <w:p>
       <w:pPr>
-        <w:spacing w:before="80" w:after="80"/>
+        <w:spacing w:before="60" w:after="60"/>
       </w:pPr>
       <w:r>
         <w:rPr>
           <w:color w:val="D1D5DB"/>
-          <w:sz w:val="16"/>
+          <w:sz w:val="14"/>
         </w:rPr>
-        <w:t>────────────────────────────────────────────────────────────────────────</w:t>
+        <w:t>──────────────────────────────────────────────────────────────────────────</w:t>
       </w:r>
     </w:p>
     <w:p>
       <w:pPr>
-        <w:spacing w:before="280" w:after="200"/>
+        <w:spacing w:before="240" w:after="200"/>
         <w:shd w:val="clear" w:color="auto" w:fill="1B3A6B"/>
       </w:pPr>
       <w:r>
         <w:rPr>
           <w:b/>
+          <w:i w:val="0"/>
           <w:color w:val="FFFFFF"/>
           <w:sz w:val="26"/>
         </w:rPr>
@@ -71,19 +82,19 @@
           <w:color w:val="6B7280"/>
           <w:sz w:val="21"/>
         </w:rPr>
-        <w:t>This guide walks you through everything you need to get started with Claude Code — from creating your account to building and deploying a real website. No command line or prior coding experience required.</w:t>
+        <w:t>Get Claude Code running on your computer in five steps. No command line or prior coding experience required.</w:t>
       </w:r>
     </w:p>
     <w:p>
       <w:pPr>
-        <w:spacing w:before="240" w:after="60"/>
+        <w:spacing w:before="200" w:after="60"/>
       </w:pPr>
       <w:r>
         <w:rPr>
           <w:b/>
           <w:i w:val="0"/>
           <w:color w:val="1B3A6B"/>
-          <w:sz w:val="23"/>
+          <w:sz w:val="24"/>
         </w:rPr>
         <w:t xml:space="preserve">Step 1  </w:t>
       </w:r>
@@ -101,28 +112,28 @@
           <w:b/>
           <w:i w:val="0"/>
           <w:color w:val="1B3A6B"/>
-          <w:sz w:val="23"/>
+          <w:sz w:val="24"/>
         </w:rPr>
         <w:t>Subscribe to Claude Pro</w:t>
       </w:r>
     </w:p>
     <w:p>
       <w:pPr>
-        <w:spacing w:before="40" w:after="120"/>
-        <w:ind w:left="360"/>
+        <w:spacing w:before="40" w:after="100"/>
+        <w:ind w:left="432"/>
       </w:pPr>
       <w:r>
         <w:rPr>
           <w:color w:val="1A1A2E"/>
           <w:sz w:val="21"/>
         </w:rPr>
-        <w:t>Open your browser and go to claude.ai. Create a free account if you don't have one, then upgrade to the Pro plan for $20/month. This unlocks Claude's most capable models and gives you access to Claude Code.</w:t>
+        <w:t>Open your browser and go to claude.ai. Click Sign Up to create a free Anthropic account using your email address. Once logged in, click Upgrade in the top-right corner and select the Pro plan for $20/month. This gives you access to Claude's most capable models and unlocks Claude Code for AI-powered development.</w:t>
       </w:r>
     </w:p>
     <w:p>
       <w:pPr>
         <w:spacing w:after="80"/>
-        <w:ind w:left="360"/>
+        <w:ind w:left="432"/>
       </w:pPr>
       <w:r>
         <w:rPr>
@@ -145,26 +156,26 @@
     </w:p>
     <w:p>
       <w:pPr>
-        <w:spacing w:before="80" w:after="80"/>
+        <w:spacing w:before="60" w:after="60"/>
       </w:pPr>
       <w:r>
         <w:rPr>
           <w:color w:val="D1D5DB"/>
-          <w:sz w:val="16"/>
+          <w:sz w:val="14"/>
         </w:rPr>
-        <w:t>────────────────────────────────────────────────────────────────────────</w:t>
+        <w:t>──────────────────────────────────────────────────────────────────────────</w:t>
       </w:r>
     </w:p>
     <w:p>
       <w:pPr>
-        <w:spacing w:before="240" w:after="60"/>
+        <w:spacing w:before="200" w:after="60"/>
       </w:pPr>
       <w:r>
         <w:rPr>
           <w:b/>
           <w:i w:val="0"/>
           <w:color w:val="1B3A6B"/>
-          <w:sz w:val="23"/>
+          <w:sz w:val="24"/>
         </w:rPr>
         <w:t xml:space="preserve">Step 2  </w:t>
       </w:r>
@@ -182,28 +193,28 @@
           <w:b/>
           <w:i w:val="0"/>
           <w:color w:val="1B3A6B"/>
-          <w:sz w:val="23"/>
+          <w:sz w:val="24"/>
         </w:rPr>
         <w:t>Install Claude Desktop</w:t>
       </w:r>
     </w:p>
     <w:p>
       <w:pPr>
-        <w:spacing w:before="40" w:after="120"/>
-        <w:ind w:left="360"/>
+        <w:spacing w:before="40" w:after="100"/>
+        <w:ind w:left="432"/>
       </w:pPr>
       <w:r>
         <w:rPr>
           <w:color w:val="1A1A2E"/>
           <w:sz w:val="21"/>
         </w:rPr>
-        <w:t>Download the Claude Desktop app from claude.ai/download. Install it like any other app on your Mac or Windows computer. Sign in with your Anthropic account. Claude Desktop gives you a full AI assistant on your computer — great for chatting, brainstorming, and drafting content without opening a browser.</w:t>
+        <w:t>Go to claude.ai/download in your browser. Click the download button for your operating system (Mac or Windows). Once downloaded, open the installer and follow the on-screen steps — just like installing any other app. Launch Claude Desktop and sign in with the same Anthropic account you just created. Claude Desktop is a full AI assistant you can use anytime without opening a browser.</w:t>
       </w:r>
     </w:p>
     <w:p>
       <w:pPr>
         <w:spacing w:after="80"/>
-        <w:ind w:left="360"/>
+        <w:ind w:left="432"/>
       </w:pPr>
       <w:r>
         <w:rPr>
@@ -226,26 +237,26 @@
     </w:p>
     <w:p>
       <w:pPr>
-        <w:spacing w:before="80" w:after="80"/>
+        <w:spacing w:before="60" w:after="60"/>
       </w:pPr>
       <w:r>
         <w:rPr>
           <w:color w:val="D1D5DB"/>
-          <w:sz w:val="16"/>
+          <w:sz w:val="14"/>
         </w:rPr>
-        <w:t>────────────────────────────────────────────────────────────────────────</w:t>
+        <w:t>──────────────────────────────────────────────────────────────────────────</w:t>
       </w:r>
     </w:p>
     <w:p>
       <w:pPr>
-        <w:spacing w:before="240" w:after="60"/>
+        <w:spacing w:before="200" w:after="60"/>
       </w:pPr>
       <w:r>
         <w:rPr>
           <w:b/>
           <w:i w:val="0"/>
           <w:color w:val="1B3A6B"/>
-          <w:sz w:val="23"/>
+          <w:sz w:val="24"/>
         </w:rPr>
         <w:t xml:space="preserve">Step 3  </w:t>
       </w:r>
@@ -263,69 +274,69 @@
           <w:b/>
           <w:i w:val="0"/>
           <w:color w:val="1B3A6B"/>
-          <w:sz w:val="23"/>
+          <w:sz w:val="24"/>
         </w:rPr>
         <w:t>Install Your Code Editor (IDE)</w:t>
       </w:r>
     </w:p>
     <w:p>
       <w:pPr>
-        <w:spacing w:before="40" w:after="120"/>
-        <w:ind w:left="360"/>
+        <w:spacing w:before="40" w:after="100"/>
+        <w:ind w:left="432"/>
       </w:pPr>
       <w:r>
         <w:rPr>
           <w:color w:val="1A1A2E"/>
           <w:sz w:val="21"/>
         </w:rPr>
-        <w:t>Download and install one of these AI-powered code editors — both are free and beginner-friendly:</w:t>
+        <w:t>Download one of these two AI-powered code editors — both are free and beginner-friendly:</w:t>
       </w:r>
     </w:p>
     <w:p>
       <w:pPr>
         <w:pStyle w:val="ListBullet"/>
         <w:spacing w:before="20" w:after="60"/>
-        <w:ind w:left="576"/>
+        <w:ind w:left="648"/>
       </w:pPr>
       <w:r>
         <w:rPr>
           <w:color w:val="1A1A2E"/>
           <w:sz w:val="21"/>
         </w:rPr>
-        <w:t>Antigravity (by Google) — download from the Google website and install like any app.</w:t>
+        <w:t>Antigravity (by Google) — download from Google's website and install like any app.</w:t>
       </w:r>
     </w:p>
     <w:p>
       <w:pPr>
         <w:pStyle w:val="ListBullet"/>
         <w:spacing w:before="20" w:after="60"/>
-        <w:ind w:left="576"/>
+        <w:ind w:left="648"/>
       </w:pPr>
       <w:r>
         <w:rPr>
           <w:color w:val="1A1A2E"/>
           <w:sz w:val="21"/>
         </w:rPr>
-        <w:t>Cursor — download from cursor.com and install like any app.</w:t>
+        <w:t>Cursor — go to cursor.com, click Download, and install like any app.</w:t>
       </w:r>
     </w:p>
     <w:p>
       <w:pPr>
-        <w:spacing w:before="40" w:after="120"/>
-        <w:ind w:left="360"/>
+        <w:spacing w:before="40" w:after="100"/>
+        <w:ind w:left="432"/>
       </w:pPr>
       <w:r>
         <w:rPr>
           <w:color w:val="1A1A2E"/>
           <w:sz w:val="21"/>
         </w:rPr>
-        <w:t>Both editors have a visual, point-and-click interface. No command line needed.</w:t>
+        <w:t>Both have a visual, point-and-click interface. No command line or terminal is required.</w:t>
       </w:r>
     </w:p>
     <w:p>
       <w:pPr>
         <w:spacing w:after="80"/>
-        <w:ind w:left="360"/>
+        <w:ind w:left="432"/>
       </w:pPr>
       <w:r>
         <w:rPr>
@@ -348,26 +359,26 @@
     </w:p>
     <w:p>
       <w:pPr>
-        <w:spacing w:before="80" w:after="80"/>
+        <w:spacing w:before="60" w:after="60"/>
       </w:pPr>
       <w:r>
         <w:rPr>
           <w:color w:val="D1D5DB"/>
-          <w:sz w:val="16"/>
+          <w:sz w:val="14"/>
         </w:rPr>
-        <w:t>────────────────────────────────────────────────────────────────────────</w:t>
+        <w:t>──────────────────────────────────────────────────────────────────────────</w:t>
       </w:r>
     </w:p>
     <w:p>
       <w:pPr>
-        <w:spacing w:before="240" w:after="60"/>
+        <w:spacing w:before="200" w:after="60"/>
       </w:pPr>
       <w:r>
         <w:rPr>
           <w:b/>
           <w:i w:val="0"/>
           <w:color w:val="1B3A6B"/>
-          <w:sz w:val="23"/>
+          <w:sz w:val="24"/>
         </w:rPr>
         <w:t xml:space="preserve">Step 4  </w:t>
       </w:r>
@@ -385,46 +396,71 @@
           <w:b/>
           <w:i w:val="0"/>
           <w:color w:val="1B3A6B"/>
-          <w:sz w:val="23"/>
+          <w:sz w:val="24"/>
         </w:rPr>
-        <w:t>Find the Claude Code Extension</w:t>
+        <w:t>Find and Install the Claude Code Extension</w:t>
       </w:r>
     </w:p>
     <w:p>
       <w:pPr>
-        <w:spacing w:before="40" w:after="120"/>
-        <w:ind w:left="360"/>
+        <w:spacing w:before="40" w:after="100"/>
+        <w:ind w:left="432"/>
       </w:pPr>
       <w:r>
         <w:rPr>
           <w:color w:val="1A1A2E"/>
           <w:sz w:val="21"/>
         </w:rPr>
-        <w:t>Open your IDE (Antigravity or Cursor). In the left sidebar, click the Extensions icon (it looks like four small squares). In the search box, type Claude Code. Click the result and press Install. The extension connects your editor directly to Claude.</w:t>
+        <w:t>Open your IDE (Antigravity or Cursor). Look at the left sidebar — click the Extensions icon (it looks like four small squares or a puzzle piece). A search panel will open. Type  Claude Code  in the search box. Click the Claude Code result from Anthropic, then click the blue Install button. The extension connects your editor directly to Claude.</w:t>
       </w:r>
     </w:p>
     <w:p>
       <w:pPr>
-        <w:spacing w:before="80" w:after="80"/>
+        <w:spacing w:after="80"/>
+        <w:ind w:left="432"/>
+        <w:shd w:val="clear" w:color="auto" w:fill="FEF9EC"/>
+      </w:pPr>
+      <w:r>
+        <w:rPr>
+          <w:b/>
+          <w:i w:val="0"/>
+          <w:color w:val="C8963E"/>
+          <w:sz w:val="20"/>
+        </w:rPr>
+        <w:t xml:space="preserve">  Note: </w:t>
+      </w:r>
+      <w:r>
+        <w:rPr>
+          <w:b w:val="0"/>
+          <w:i w:val="0"/>
+          <w:color w:val="78551F"/>
+          <w:sz w:val="20"/>
+        </w:rPr>
+        <w:t xml:space="preserve">If you don't see the Extensions icon, go to the top menu: View → Extensions.  </w:t>
+      </w:r>
+    </w:p>
+    <w:p>
+      <w:pPr>
+        <w:spacing w:before="60" w:after="60"/>
       </w:pPr>
       <w:r>
         <w:rPr>
           <w:color w:val="D1D5DB"/>
-          <w:sz w:val="16"/>
+          <w:sz w:val="14"/>
         </w:rPr>
-        <w:t>────────────────────────────────────────────────────────────────────────</w:t>
+        <w:t>──────────────────────────────────────────────────────────────────────────</w:t>
       </w:r>
     </w:p>
     <w:p>
       <w:pPr>
-        <w:spacing w:before="240" w:after="60"/>
+        <w:spacing w:before="200" w:after="60"/>
       </w:pPr>
       <w:r>
         <w:rPr>
           <w:b/>
           <w:i w:val="0"/>
           <w:color w:val="1B3A6B"/>
-          <w:sz w:val="23"/>
+          <w:sz w:val="24"/>
         </w:rPr>
         <w:t xml:space="preserve">Step 5  </w:t>
       </w:r>
@@ -442,22 +478,22 @@
           <w:b/>
           <w:i w:val="0"/>
           <w:color w:val="1B3A6B"/>
-          <w:sz w:val="23"/>
+          <w:sz w:val="24"/>
         </w:rPr>
-        <w:t>Log In &amp; Activate Claude Code</w:t>
+        <w:t>Log In and Activate Claude Code</w:t>
       </w:r>
     </w:p>
     <w:p>
       <w:pPr>
-        <w:spacing w:before="40" w:after="120"/>
-        <w:ind w:left="360"/>
+        <w:spacing w:before="40" w:after="100"/>
+        <w:ind w:left="432"/>
       </w:pPr>
       <w:r>
         <w:rPr>
           <w:color w:val="1A1A2E"/>
           <w:sz w:val="21"/>
         </w:rPr>
-        <w:t>After installation, a Claude Code panel will appear in your IDE sidebar. Click it and sign in with your Anthropic account (the same login you use on claude.ai). You're now fully set up — Claude Code is ready to help you write, edit, and build.</w:t>
+        <w:t>After the extension installs, a Claude Code panel will appear in your IDE sidebar — click it to open it. You'll be prompted to sign in. Enter your Anthropic account credentials (the same email and password you use on claude.ai). Once signed in, Claude Code is fully active and ready to help you build.</w:t>
       </w:r>
     </w:p>
     <w:p>
@@ -467,12 +503,13 @@
     </w:p>
     <w:p>
       <w:pPr>
-        <w:spacing w:before="280" w:after="200"/>
+        <w:spacing w:before="240" w:after="200"/>
         <w:shd w:val="clear" w:color="auto" w:fill="2D6A4F"/>
       </w:pPr>
       <w:r>
         <w:rPr>
           <w:b/>
+          <w:i w:val="0"/>
           <w:color w:val="FFFFFF"/>
           <w:sz w:val="26"/>
         </w:rPr>
@@ -488,19 +525,19 @@
           <w:color w:val="6B7280"/>
           <w:sz w:val="21"/>
         </w:rPr>
-        <w:t>You don't need to know HTML, CSS, or JavaScript. Just describe what you want in plain English and Claude Code will write the code for you. Here's the full workflow.</w:t>
+        <w:t>You don't need to know HTML, CSS, or JavaScript. Describe what you want in plain English and Claude Code writes the code for you. Here's the complete workflow.</w:t>
       </w:r>
     </w:p>
     <w:p>
       <w:pPr>
-        <w:spacing w:before="240" w:after="60"/>
+        <w:spacing w:before="200" w:after="60"/>
       </w:pPr>
       <w:r>
         <w:rPr>
           <w:b/>
           <w:i w:val="0"/>
           <w:color w:val="1B3A6B"/>
-          <w:sz w:val="23"/>
+          <w:sz w:val="24"/>
         </w:rPr>
         <w:t xml:space="preserve">Step 6  </w:t>
       </w:r>
@@ -518,46 +555,46 @@
           <w:b/>
           <w:i w:val="0"/>
           <w:color w:val="1B3A6B"/>
-          <w:sz w:val="23"/>
+          <w:sz w:val="24"/>
         </w:rPr>
-        <w:t>Open a New Project Folder</w:t>
+        <w:t>Create a New Project Folder</w:t>
       </w:r>
     </w:p>
     <w:p>
       <w:pPr>
-        <w:spacing w:before="40" w:after="120"/>
-        <w:ind w:left="360"/>
+        <w:spacing w:before="40" w:after="100"/>
+        <w:ind w:left="432"/>
       </w:pPr>
       <w:r>
         <w:rPr>
           <w:color w:val="1A1A2E"/>
           <w:sz w:val="21"/>
         </w:rPr>
-        <w:t>In your IDE, go to File → Open Folder (or Open…). Create a new empty folder on your computer (e.g. 'my-website') and open it. This is where your website files will live.</w:t>
+        <w:t>In your IDE, go to File → Open Folder (or File → Open… on Mac). Navigate to your Desktop or Documents and create a new empty folder — name it something like my-website or campaign-site. Open that folder in the IDE. This folder is where all your website files will be saved.</w:t>
       </w:r>
     </w:p>
     <w:p>
       <w:pPr>
-        <w:spacing w:before="80" w:after="80"/>
+        <w:spacing w:before="60" w:after="60"/>
       </w:pPr>
       <w:r>
         <w:rPr>
           <w:color w:val="D1D5DB"/>
-          <w:sz w:val="16"/>
+          <w:sz w:val="14"/>
         </w:rPr>
-        <w:t>────────────────────────────────────────────────────────────────────────</w:t>
+        <w:t>──────────────────────────────────────────────────────────────────────────</w:t>
       </w:r>
     </w:p>
     <w:p>
       <w:pPr>
-        <w:spacing w:before="240" w:after="60"/>
+        <w:spacing w:before="200" w:after="60"/>
       </w:pPr>
       <w:r>
         <w:rPr>
           <w:b/>
           <w:i w:val="0"/>
           <w:color w:val="1B3A6B"/>
-          <w:sz w:val="23"/>
+          <w:sz w:val="24"/>
         </w:rPr>
         <w:t xml:space="preserve">Step 7  </w:t>
       </w:r>
@@ -575,46 +612,46 @@
           <w:b/>
           <w:i w:val="0"/>
           <w:color w:val="1B3A6B"/>
-          <w:sz w:val="23"/>
+          <w:sz w:val="24"/>
         </w:rPr>
-        <w:t>Open the Claude Code Panel</w:t>
+        <w:t>Open the Claude Code Chat Panel</w:t>
       </w:r>
     </w:p>
     <w:p>
       <w:pPr>
-        <w:spacing w:before="40" w:after="120"/>
-        <w:ind w:left="360"/>
+        <w:spacing w:before="40" w:after="100"/>
+        <w:ind w:left="432"/>
       </w:pPr>
       <w:r>
         <w:rPr>
           <w:color w:val="1A1A2E"/>
           <w:sz w:val="21"/>
         </w:rPr>
-        <w:t>Click the Claude Code icon in your IDE sidebar to open the chat panel. You'll see a text box where you can type instructions — just like texting or messaging.</w:t>
+        <w:t>Click the Claude Code icon in the left sidebar to open the chat panel. You'll see a text input box — this is where you give Claude instructions. It works exactly like texting: type what you want, press Enter.</w:t>
       </w:r>
     </w:p>
     <w:p>
       <w:pPr>
-        <w:spacing w:before="80" w:after="80"/>
+        <w:spacing w:before="60" w:after="60"/>
       </w:pPr>
       <w:r>
         <w:rPr>
           <w:color w:val="D1D5DB"/>
-          <w:sz w:val="16"/>
+          <w:sz w:val="14"/>
         </w:rPr>
-        <w:t>────────────────────────────────────────────────────────────────────────</w:t>
+        <w:t>──────────────────────────────────────────────────────────────────────────</w:t>
       </w:r>
     </w:p>
     <w:p>
       <w:pPr>
-        <w:spacing w:before="240" w:after="60"/>
+        <w:spacing w:before="200" w:after="60"/>
       </w:pPr>
       <w:r>
         <w:rPr>
           <w:b/>
           <w:i w:val="0"/>
           <w:color w:val="1B3A6B"/>
-          <w:sz w:val="23"/>
+          <w:sz w:val="24"/>
         </w:rPr>
         <w:t xml:space="preserve">Step 8  </w:t>
       </w:r>
@@ -632,22 +669,22 @@
           <w:b/>
           <w:i w:val="0"/>
           <w:color w:val="1B3A6B"/>
-          <w:sz w:val="23"/>
+          <w:sz w:val="24"/>
         </w:rPr>
         <w:t>Describe Your Website</w:t>
       </w:r>
     </w:p>
     <w:p>
       <w:pPr>
-        <w:spacing w:before="40" w:after="120"/>
-        <w:ind w:left="360"/>
+        <w:spacing w:before="40" w:after="100"/>
+        <w:ind w:left="432"/>
       </w:pPr>
       <w:r>
         <w:rPr>
           <w:color w:val="1A1A2E"/>
           <w:sz w:val="21"/>
         </w:rPr>
-        <w:t>Type a description of the website you want. Be as specific as you like. For example:</w:t>
+        <w:t>Type a description of the website you want to build. Be as specific as possible — include the purpose, sections, colors, and any content. Example prompt:</w:t>
       </w:r>
     </w:p>
     <w:p>
@@ -661,44 +698,44 @@
           <w:color w:val="6B7280"/>
           <w:sz w:val="20"/>
         </w:rPr>
-        <w:t>"Build me a single-page campaign website for Jane Smith running for Belmont Town Meeting. Include a hero section with her name and tagline, an About section, a Priorities section with 3 issue cards, and a contact form. Use a navy and gold color scheme."</w:t>
+        <w:t>"Build me a single-page campaign website for Jane Smith running for Belmont Town Meeting, Precinct 4. Include: a full-width hero section with her name and tagline "Thoughtful Leadership for Belmont", an About section with a photo placeholder, a Priorities section with 3 cards (Education, Fiscal Responsibility, Civic Engagement), a Get Involved contact form, and a footer. Use a navy blue and warm gold color scheme with Playfair Display for headings."</w:t>
       </w:r>
     </w:p>
     <w:p>
       <w:pPr>
-        <w:spacing w:before="40" w:after="120"/>
-        <w:ind w:left="360"/>
+        <w:spacing w:before="40" w:after="100"/>
+        <w:ind w:left="432"/>
       </w:pPr>
       <w:r>
         <w:rPr>
           <w:color w:val="1A1A2E"/>
           <w:sz w:val="21"/>
         </w:rPr>
-        <w:t>Claude Code will generate all the files (index.html, style.css, main.js) automatically.</w:t>
+        <w:t>Claude Code will create all the files — index.html, style.css, main.js — automatically in your project folder.</w:t>
       </w:r>
     </w:p>
     <w:p>
       <w:pPr>
-        <w:spacing w:before="80" w:after="80"/>
+        <w:spacing w:before="60" w:after="60"/>
       </w:pPr>
       <w:r>
         <w:rPr>
           <w:color w:val="D1D5DB"/>
-          <w:sz w:val="16"/>
+          <w:sz w:val="14"/>
         </w:rPr>
-        <w:t>────────────────────────────────────────────────────────────────────────</w:t>
+        <w:t>──────────────────────────────────────────────────────────────────────────</w:t>
       </w:r>
     </w:p>
     <w:p>
       <w:pPr>
-        <w:spacing w:before="240" w:after="60"/>
+        <w:spacing w:before="200" w:after="60"/>
       </w:pPr>
       <w:r>
         <w:rPr>
           <w:b/>
           <w:i w:val="0"/>
           <w:color w:val="1B3A6B"/>
-          <w:sz w:val="23"/>
+          <w:sz w:val="24"/>
         </w:rPr>
         <w:t xml:space="preserve">Step 9  </w:t>
       </w:r>
@@ -716,46 +753,71 @@
           <w:b/>
           <w:i w:val="0"/>
           <w:color w:val="1B3A6B"/>
-          <w:sz w:val="23"/>
+          <w:sz w:val="24"/>
         </w:rPr>
         <w:t>Preview Your Site in the Browser</w:t>
       </w:r>
     </w:p>
     <w:p>
       <w:pPr>
-        <w:spacing w:before="40" w:after="120"/>
-        <w:ind w:left="360"/>
+        <w:spacing w:before="40" w:after="100"/>
+        <w:ind w:left="432"/>
       </w:pPr>
       <w:r>
         <w:rPr>
           <w:color w:val="1A1A2E"/>
           <w:sz w:val="21"/>
         </w:rPr>
-        <w:t>Once the files are created, right-click on index.html in the IDE file explorer and choose Open with Live Server or Open in Browser. Your website will open in your default browser so you can see exactly how it looks.</w:t>
+        <w:t>In the IDE file explorer (left panel), right-click on index.html and choose Open with Live Server  or  Reveal in Finder/Explorer then double-click the file. Your website will open in your default browser. Live Server will auto-refresh every time Claude makes a change.</w:t>
       </w:r>
     </w:p>
     <w:p>
       <w:pPr>
-        <w:spacing w:before="80" w:after="80"/>
+        <w:spacing w:after="80"/>
+        <w:ind w:left="432"/>
+        <w:shd w:val="clear" w:color="auto" w:fill="FEF9EC"/>
+      </w:pPr>
+      <w:r>
+        <w:rPr>
+          <w:b/>
+          <w:i w:val="0"/>
+          <w:color w:val="C8963E"/>
+          <w:sz w:val="20"/>
+        </w:rPr>
+        <w:t xml:space="preserve">  Note: </w:t>
+      </w:r>
+      <w:r>
+        <w:rPr>
+          <w:b w:val="0"/>
+          <w:i w:val="0"/>
+          <w:color w:val="78551F"/>
+          <w:sz w:val="20"/>
+        </w:rPr>
+        <w:t xml:space="preserve">If 'Open with Live Server' isn't available, install the Live Server extension the same way you installed Claude Code.  </w:t>
+      </w:r>
+    </w:p>
+    <w:p>
+      <w:pPr>
+        <w:spacing w:before="60" w:after="60"/>
       </w:pPr>
       <w:r>
         <w:rPr>
           <w:color w:val="D1D5DB"/>
-          <w:sz w:val="16"/>
+          <w:sz w:val="14"/>
         </w:rPr>
-        <w:t>────────────────────────────────────────────────────────────────────────</w:t>
+        <w:t>──────────────────────────────────────────────────────────────────────────</w:t>
       </w:r>
     </w:p>
     <w:p>
       <w:pPr>
-        <w:spacing w:before="240" w:after="60"/>
+        <w:spacing w:before="200" w:after="60"/>
       </w:pPr>
       <w:r>
         <w:rPr>
           <w:b/>
           <w:i w:val="0"/>
           <w:color w:val="1B3A6B"/>
-          <w:sz w:val="23"/>
+          <w:sz w:val="24"/>
         </w:rPr>
         <w:t xml:space="preserve">Step 10  </w:t>
       </w:r>
@@ -773,91 +835,105 @@
           <w:b/>
           <w:i w:val="0"/>
           <w:color w:val="1B3A6B"/>
-          <w:sz w:val="23"/>
+          <w:sz w:val="24"/>
         </w:rPr>
         <w:t>Refine with Follow-Up Instructions</w:t>
       </w:r>
     </w:p>
     <w:p>
       <w:pPr>
-        <w:spacing w:before="40" w:after="120"/>
-        <w:ind w:left="360"/>
+        <w:spacing w:before="40" w:after="100"/>
+        <w:ind w:left="432"/>
       </w:pPr>
       <w:r>
         <w:rPr>
           <w:color w:val="1A1A2E"/>
           <w:sz w:val="21"/>
         </w:rPr>
-        <w:t>Don't like something? Just tell Claude Code what to change — no need to touch the code yourself. Examples:</w:t>
+        <w:t>Don't like something? Just type a follow-up in the Claude Code panel. No need to touch the code yourself. Examples:</w:t>
       </w:r>
     </w:p>
     <w:p>
       <w:pPr>
         <w:pStyle w:val="ListBullet"/>
         <w:spacing w:before="20" w:after="60"/>
-        <w:ind w:left="576"/>
+        <w:ind w:left="648"/>
       </w:pPr>
       <w:r>
         <w:rPr>
           <w:color w:val="1A1A2E"/>
           <w:sz w:val="21"/>
         </w:rPr>
-        <w:t>"Change the background color to dark navy."</w:t>
+        <w:t>"Change the hero background to a deeper navy gradient."</w:t>
       </w:r>
     </w:p>
     <w:p>
       <w:pPr>
         <w:pStyle w:val="ListBullet"/>
         <w:spacing w:before="20" w:after="60"/>
-        <w:ind w:left="576"/>
+        <w:ind w:left="648"/>
       </w:pPr>
       <w:r>
         <w:rPr>
           <w:color w:val="1A1A2E"/>
           <w:sz w:val="21"/>
         </w:rPr>
-        <w:t>"Make the headline font larger and use Playfair Display."</w:t>
+        <w:t>"Add a fifth step to the setup section about form submissions."</w:t>
       </w:r>
     </w:p>
     <w:p>
       <w:pPr>
         <w:pStyle w:val="ListBullet"/>
         <w:spacing w:before="20" w:after="60"/>
-        <w:ind w:left="576"/>
+        <w:ind w:left="648"/>
       </w:pPr>
       <w:r>
         <w:rPr>
           <w:color w:val="1A1A2E"/>
           <w:sz w:val="21"/>
         </w:rPr>
-        <w:t>"Add a fourth priority card about housing."</w:t>
+        <w:t>"Make all the buttons gold with rounded corners."</w:t>
       </w:r>
     </w:p>
     <w:p>
       <w:pPr>
         <w:pStyle w:val="ListBullet"/>
         <w:spacing w:before="20" w:after="60"/>
-        <w:ind w:left="576"/>
+        <w:ind w:left="648"/>
       </w:pPr>
       <w:r>
         <w:rPr>
           <w:color w:val="1A1A2E"/>
           <w:sz w:val="21"/>
         </w:rPr>
-        <w:t>"Make the layout work better on mobile phones."</w:t>
+        <w:t>"Add a photo of Jane to the About section — the file is called jane.jpg."</w:t>
       </w:r>
     </w:p>
     <w:p>
       <w:pPr>
-        <w:spacing w:before="40" w:after="120"/>
-        <w:ind w:left="360"/>
+        <w:pStyle w:val="ListBullet"/>
+        <w:spacing w:before="20" w:after="60"/>
+        <w:ind w:left="648"/>
       </w:pPr>
       <w:r>
         <w:rPr>
           <w:color w:val="1A1A2E"/>
           <w:sz w:val="21"/>
         </w:rPr>
-        <w:t>Keep iterating until the site looks exactly the way you want.</w:t>
+        <w:t>"Make the site look good on a phone screen."</w:t>
+      </w:r>
+    </w:p>
+    <w:p>
+      <w:pPr>
+        <w:spacing w:before="40" w:after="100"/>
+        <w:ind w:left="432"/>
+      </w:pPr>
+      <w:r>
+        <w:rPr>
+          <w:color w:val="1A1A2E"/>
+          <w:sz w:val="21"/>
+        </w:rPr>
+        <w:t>Keep refining until the site looks and works exactly the way you want.</w:t>
       </w:r>
     </w:p>
     <w:p>
@@ -867,16 +943,17 @@
     </w:p>
     <w:p>
       <w:pPr>
-        <w:spacing w:before="280" w:after="200"/>
-        <w:shd w:val="clear" w:color="auto" w:fill="C8963E"/>
+        <w:spacing w:before="240" w:after="200"/>
+        <w:shd w:val="clear" w:color="auto" w:fill="1B3A6B"/>
       </w:pPr>
       <w:r>
         <w:rPr>
           <w:b/>
-          <w:color w:val="1B3A6B"/>
+          <w:i w:val="0"/>
+          <w:color w:val="FFFFFF"/>
           <w:sz w:val="26"/>
         </w:rPr>
-        <w:t xml:space="preserve">  PART 3 — Deploy Your Website (Publish It Live)  </w:t>
+        <w:t xml:space="preserve">  PART 3 — Deploy on GitHub Pages (Free)  </w:t>
       </w:r>
     </w:p>
     <w:p>
@@ -888,32 +965,34 @@
           <w:color w:val="6B7280"/>
           <w:sz w:val="21"/>
         </w:rPr>
-        <w:t>Once your site looks good, it's time to put it on the internet so anyone can visit it. The options below are all free or very low cost, and require no command line.</w:t>
+        <w:t>GitHub Pages hosts your website for free. Your site gets a live URL like yourusername.github.io/my-site — shareable immediately, no server or hosting fees.</w:t>
       </w:r>
     </w:p>
     <w:p>
       <w:pPr>
-        <w:spacing w:before="360" w:after="120"/>
-      </w:pPr>
-      <w:r>
-        <w:rPr>
-          <w:b/>
-          <w:color w:val="1B3A6B"/>
-          <w:sz w:val="28"/>
-        </w:rPr>
-        <w:t>Option A — GitHub Pages (Free, Recommended)</w:t>
-      </w:r>
-    </w:p>
-    <w:p>
-      <w:pPr>
-        <w:spacing w:before="240" w:after="60"/>
+        <w:spacing w:before="320" w:after="160"/>
+        <w:shd w:val="clear" w:color="auto" w:fill="EBF0F8"/>
       </w:pPr>
       <w:r>
         <w:rPr>
           <w:b/>
           <w:i w:val="0"/>
           <w:color w:val="1B3A6B"/>
-          <w:sz w:val="23"/>
+          <w:sz w:val="22"/>
+        </w:rPr>
+        <w:t xml:space="preserve">  Section A: Create Your GitHub Account &amp; Repository  </w:t>
+      </w:r>
+    </w:p>
+    <w:p>
+      <w:pPr>
+        <w:spacing w:before="200" w:after="60"/>
+      </w:pPr>
+      <w:r>
+        <w:rPr>
+          <w:b/>
+          <w:i w:val="0"/>
+          <w:color w:val="1B3A6B"/>
+          <w:sz w:val="24"/>
         </w:rPr>
         <w:t xml:space="preserve">Step A1  </w:t>
       </w:r>
@@ -931,28 +1010,28 @@
           <w:b/>
           <w:i w:val="0"/>
           <w:color w:val="1B3A6B"/>
-          <w:sz w:val="23"/>
+          <w:sz w:val="24"/>
         </w:rPr>
         <w:t>Create a Free GitHub Account</w:t>
       </w:r>
     </w:p>
     <w:p>
       <w:pPr>
-        <w:spacing w:before="40" w:after="120"/>
-        <w:ind w:left="360"/>
+        <w:spacing w:before="40" w:after="100"/>
+        <w:ind w:left="432"/>
       </w:pPr>
       <w:r>
         <w:rPr>
           <w:color w:val="1A1A2E"/>
           <w:sz w:val="21"/>
         </w:rPr>
-        <w:t>Go to github.com and sign up for a free account. GitHub is where your website files will be stored and served from.</w:t>
+        <w:t>Open your browser and go to github.com. Click Sign up in the top-right corner. Enter your email address, create a password, and choose a username (this will appear in your site URL, e.g. github.com/janesmithbelmont). Follow the verification steps and complete the account setup.</w:t>
       </w:r>
     </w:p>
     <w:p>
       <w:pPr>
         <w:spacing w:after="80"/>
-        <w:ind w:left="360"/>
+        <w:ind w:left="432"/>
       </w:pPr>
       <w:r>
         <w:rPr>
@@ -975,26 +1054,26 @@
     </w:p>
     <w:p>
       <w:pPr>
-        <w:spacing w:before="80" w:after="80"/>
+        <w:spacing w:before="60" w:after="60"/>
       </w:pPr>
       <w:r>
         <w:rPr>
           <w:color w:val="D1D5DB"/>
-          <w:sz w:val="16"/>
+          <w:sz w:val="14"/>
         </w:rPr>
-        <w:t>────────────────────────────────────────────────────────────────────────</w:t>
+        <w:t>──────────────────────────────────────────────────────────────────────────</w:t>
       </w:r>
     </w:p>
     <w:p>
       <w:pPr>
-        <w:spacing w:before="240" w:after="60"/>
+        <w:spacing w:before="200" w:after="60"/>
       </w:pPr>
       <w:r>
         <w:rPr>
           <w:b/>
           <w:i w:val="0"/>
           <w:color w:val="1B3A6B"/>
-          <w:sz w:val="23"/>
+          <w:sz w:val="24"/>
         </w:rPr>
         <w:t xml:space="preserve">Step A2  </w:t>
       </w:r>
@@ -1012,46 +1091,101 @@
           <w:b/>
           <w:i w:val="0"/>
           <w:color w:val="1B3A6B"/>
-          <w:sz w:val="23"/>
+          <w:sz w:val="24"/>
         </w:rPr>
         <w:t>Create a New Repository</w:t>
       </w:r>
     </w:p>
     <w:p>
       <w:pPr>
-        <w:spacing w:before="40" w:after="120"/>
-        <w:ind w:left="360"/>
+        <w:spacing w:before="40" w:after="100"/>
+        <w:ind w:left="432"/>
       </w:pPr>
       <w:r>
         <w:rPr>
           <w:color w:val="1A1A2E"/>
           <w:sz w:val="21"/>
         </w:rPr>
-        <w:t>Once logged in, click the green New button (or the + icon at the top right). Name your repository — e.g. my-campaign-site. Set it to Public. Click Create repository.</w:t>
+        <w:t>Once logged in, click the green New button on the left, or click the + icon in the top-right and choose New repository. Fill in the form:</w:t>
       </w:r>
     </w:p>
     <w:p>
       <w:pPr>
-        <w:spacing w:before="80" w:after="80"/>
+        <w:pStyle w:val="ListBullet"/>
+        <w:spacing w:before="20" w:after="60"/>
+        <w:ind w:left="648"/>
+      </w:pPr>
+      <w:r>
+        <w:rPr>
+          <w:color w:val="1A1A2E"/>
+          <w:sz w:val="21"/>
+        </w:rPr>
+        <w:t>Repository name: type something like  my-campaign-site  (no spaces — use hyphens).</w:t>
+      </w:r>
+    </w:p>
+    <w:p>
+      <w:pPr>
+        <w:pStyle w:val="ListBullet"/>
+        <w:spacing w:before="20" w:after="60"/>
+        <w:ind w:left="648"/>
+      </w:pPr>
+      <w:r>
+        <w:rPr>
+          <w:color w:val="1A1A2E"/>
+          <w:sz w:val="21"/>
+        </w:rPr>
+        <w:t>Visibility: select Public (required for free GitHub Pages hosting).</w:t>
+      </w:r>
+    </w:p>
+    <w:p>
+      <w:pPr>
+        <w:pStyle w:val="ListBullet"/>
+        <w:spacing w:before="20" w:after="60"/>
+        <w:ind w:left="648"/>
+      </w:pPr>
+      <w:r>
+        <w:rPr>
+          <w:color w:val="1A1A2E"/>
+          <w:sz w:val="21"/>
+        </w:rPr>
+        <w:t>Leave all other checkboxes unchecked.</w:t>
+      </w:r>
+    </w:p>
+    <w:p>
+      <w:pPr>
+        <w:spacing w:before="40" w:after="100"/>
+        <w:ind w:left="432"/>
+      </w:pPr>
+      <w:r>
+        <w:rPr>
+          <w:color w:val="1A1A2E"/>
+          <w:sz w:val="21"/>
+        </w:rPr>
+        <w:t>Click the green Create repository button at the bottom.</w:t>
+      </w:r>
+    </w:p>
+    <w:p>
+      <w:pPr>
+        <w:spacing w:before="60" w:after="60"/>
       </w:pPr>
       <w:r>
         <w:rPr>
           <w:color w:val="D1D5DB"/>
-          <w:sz w:val="16"/>
+          <w:sz w:val="14"/>
         </w:rPr>
-        <w:t>────────────────────────────────────────────────────────────────────────</w:t>
+        <w:t>──────────────────────────────────────────────────────────────────────────</w:t>
       </w:r>
     </w:p>
     <w:p>
       <w:pPr>
-        <w:spacing w:before="240" w:after="60"/>
+        <w:spacing w:before="200" w:after="60"/>
       </w:pPr>
       <w:r>
         <w:rPr>
           <w:b/>
           <w:i w:val="0"/>
           <w:color w:val="1B3A6B"/>
-          <w:sz w:val="23"/>
+          <w:sz w:val="24"/>
         </w:rPr>
         <w:t xml:space="preserve">Step A3  </w:t>
       </w:r>
@@ -1069,46 +1203,130 @@
           <w:b/>
           <w:i w:val="0"/>
           <w:color w:val="1B3A6B"/>
-          <w:sz w:val="23"/>
+          <w:sz w:val="24"/>
         </w:rPr>
-        <w:t>Upload Your Files</w:t>
+        <w:t>Upload Your Website Files</w:t>
       </w:r>
     </w:p>
     <w:p>
       <w:pPr>
-        <w:spacing w:before="40" w:after="120"/>
-        <w:ind w:left="360"/>
+        <w:spacing w:before="40" w:after="100"/>
+        <w:ind w:left="432"/>
       </w:pPr>
       <w:r>
         <w:rPr>
           <w:color w:val="1A1A2E"/>
           <w:sz w:val="21"/>
         </w:rPr>
-        <w:t>On your new repository page, click Add file → Upload files. Drag and drop your index.html, style.css, main.js, and any images into the upload area. Scroll down and click Commit changes.</w:t>
+        <w:t>On your new empty repository page, click Add file → Upload files. A file upload area will appear. Open your project folder on your computer and drag all your files into the browser upload area:</w:t>
       </w:r>
     </w:p>
     <w:p>
       <w:pPr>
-        <w:spacing w:before="80" w:after="80"/>
+        <w:pStyle w:val="ListBullet"/>
+        <w:spacing w:before="20" w:after="60"/>
+        <w:ind w:left="648"/>
+      </w:pPr>
+      <w:r>
+        <w:rPr>
+          <w:color w:val="1A1A2E"/>
+          <w:sz w:val="21"/>
+        </w:rPr>
+        <w:t>index.html</w:t>
+      </w:r>
+    </w:p>
+    <w:p>
+      <w:pPr>
+        <w:pStyle w:val="ListBullet"/>
+        <w:spacing w:before="20" w:after="60"/>
+        <w:ind w:left="648"/>
+      </w:pPr>
+      <w:r>
+        <w:rPr>
+          <w:color w:val="1A1A2E"/>
+          <w:sz w:val="21"/>
+        </w:rPr>
+        <w:t>style.css</w:t>
+      </w:r>
+    </w:p>
+    <w:p>
+      <w:pPr>
+        <w:pStyle w:val="ListBullet"/>
+        <w:spacing w:before="20" w:after="60"/>
+        <w:ind w:left="648"/>
+      </w:pPr>
+      <w:r>
+        <w:rPr>
+          <w:color w:val="1A1A2E"/>
+          <w:sz w:val="21"/>
+        </w:rPr>
+        <w:t>main.js</w:t>
+      </w:r>
+    </w:p>
+    <w:p>
+      <w:pPr>
+        <w:pStyle w:val="ListBullet"/>
+        <w:spacing w:before="20" w:after="60"/>
+        <w:ind w:left="648"/>
+      </w:pPr>
+      <w:r>
+        <w:rPr>
+          <w:color w:val="1A1A2E"/>
+          <w:sz w:val="21"/>
+        </w:rPr>
+        <w:t>Any images (e.g. photo.jpg, logo.png)</w:t>
+      </w:r>
+    </w:p>
+    <w:p>
+      <w:pPr>
+        <w:spacing w:before="40" w:after="100"/>
+        <w:ind w:left="432"/>
+      </w:pPr>
+      <w:r>
+        <w:rPr>
+          <w:color w:val="1A1A2E"/>
+          <w:sz w:val="21"/>
+        </w:rPr>
+        <w:t>Scroll down to the Commit changes section. In the first text box, type a short description like  Initial website upload. Then click the green Commit changes button. Wait for the upload to complete — you'll see your files listed in the repository.</w:t>
+      </w:r>
+    </w:p>
+    <w:p>
+      <w:pPr>
+        <w:spacing w:before="60" w:after="60"/>
       </w:pPr>
       <w:r>
         <w:rPr>
           <w:color w:val="D1D5DB"/>
-          <w:sz w:val="16"/>
+          <w:sz w:val="14"/>
         </w:rPr>
-        <w:t>────────────────────────────────────────────────────────────────────────</w:t>
+        <w:t>──────────────────────────────────────────────────────────────────────────</w:t>
       </w:r>
     </w:p>
     <w:p>
       <w:pPr>
-        <w:spacing w:before="240" w:after="60"/>
+        <w:spacing w:before="320" w:after="160"/>
+        <w:shd w:val="clear" w:color="auto" w:fill="EBF0F8"/>
       </w:pPr>
       <w:r>
         <w:rPr>
           <w:b/>
           <w:i w:val="0"/>
           <w:color w:val="1B3A6B"/>
-          <w:sz w:val="23"/>
+          <w:sz w:val="22"/>
+        </w:rPr>
+        <w:t xml:space="preserve">  Section B: Enable GitHub Pages  </w:t>
+      </w:r>
+    </w:p>
+    <w:p>
+      <w:pPr>
+        <w:spacing w:before="200" w:after="60"/>
+      </w:pPr>
+      <w:r>
+        <w:rPr>
+          <w:b/>
+          <w:i w:val="0"/>
+          <w:color w:val="1B3A6B"/>
+          <w:sz w:val="24"/>
         </w:rPr>
         <w:t xml:space="preserve">Step A4  </w:t>
       </w:r>
@@ -1126,74 +1344,48 @@
           <w:b/>
           <w:i w:val="0"/>
           <w:color w:val="1B3A6B"/>
-          <w:sz w:val="23"/>
+          <w:sz w:val="24"/>
         </w:rPr>
-        <w:t>Enable GitHub Pages</w:t>
+        <w:t>Open Repository Settings</w:t>
       </w:r>
     </w:p>
     <w:p>
       <w:pPr>
-        <w:spacing w:before="40" w:after="120"/>
-        <w:ind w:left="360"/>
+        <w:spacing w:before="40" w:after="100"/>
+        <w:ind w:left="432"/>
       </w:pPr>
       <w:r>
         <w:rPr>
           <w:color w:val="1A1A2E"/>
           <w:sz w:val="21"/>
         </w:rPr>
-        <w:t>Go to your repository Settings (tab at the top). In the left sidebar, click Pages. Under Source, select Deploy from a branch. Choose main and click Save. GitHub will give you a free URL like: https://yourusername.github.io/my-campaign-site</w:t>
+        <w:t>In your repository (the page showing your uploaded files), click the Settings tab at the top of the page. It has a gear icon. This opens the repository settings.</w:t>
       </w:r>
     </w:p>
     <w:p>
       <w:pPr>
-        <w:spacing w:before="40" w:after="120"/>
-        <w:ind w:left="360"/>
+        <w:spacing w:before="60" w:after="60"/>
       </w:pPr>
       <w:r>
         <w:rPr>
-          <w:color w:val="1A1A2E"/>
-          <w:sz w:val="21"/>
+          <w:color w:val="D1D5DB"/>
+          <w:sz w:val="14"/>
         </w:rPr>
-        <w:t>Your site is now live. Share that link anywhere — social media, email, flyers.</w:t>
+        <w:t>──────────────────────────────────────────────────────────────────────────</w:t>
       </w:r>
     </w:p>
     <w:p>
       <w:pPr>
-        <w:spacing w:before="80" w:after="80"/>
-      </w:pPr>
-      <w:r>
-        <w:rPr>
-          <w:color w:val="D1D5DB"/>
-          <w:sz w:val="16"/>
-        </w:rPr>
-        <w:t>────────────────────────────────────────────────────────────────────────</w:t>
-      </w:r>
-    </w:p>
-    <w:p>
-      <w:pPr>
-        <w:spacing w:before="360" w:after="120"/>
-      </w:pPr>
-      <w:r>
-        <w:rPr>
-          <w:b/>
-          <w:color w:val="1B3A6B"/>
-          <w:sz w:val="28"/>
-        </w:rPr>
-        <w:t>Option B — Netlify Drop (Fastest, No Account Required)</w:t>
-      </w:r>
-    </w:p>
-    <w:p>
-      <w:pPr>
-        <w:spacing w:before="240" w:after="60"/>
+        <w:spacing w:before="200" w:after="60"/>
       </w:pPr>
       <w:r>
         <w:rPr>
           <w:b/>
           <w:i w:val="0"/>
           <w:color w:val="1B3A6B"/>
-          <w:sz w:val="23"/>
+          <w:sz w:val="24"/>
         </w:rPr>
-        <w:t xml:space="preserve">Step B1  </w:t>
+        <w:t xml:space="preserve">Step A5  </w:t>
       </w:r>
       <w:r>
         <w:rPr>
@@ -1209,28 +1401,29 @@
           <w:b/>
           <w:i w:val="0"/>
           <w:color w:val="1B3A6B"/>
-          <w:sz w:val="23"/>
+          <w:sz w:val="24"/>
         </w:rPr>
-        <w:t>Go to Netlify Drop</w:t>
+        <w:t>Turn On GitHub Pages</w:t>
       </w:r>
     </w:p>
     <w:p>
       <w:pPr>
-        <w:spacing w:before="40" w:after="120"/>
-        <w:ind w:left="360"/>
+        <w:spacing w:before="40" w:after="100"/>
+        <w:ind w:left="432"/>
       </w:pPr>
       <w:r>
         <w:rPr>
           <w:color w:val="1A1A2E"/>
           <w:sz w:val="21"/>
         </w:rPr>
-        <w:t>Open your browser and go to app.netlify.com/drop. No account needed to try it.</w:t>
+        <w:t>In the Settings left sidebar, scroll down and click Pages. You'll see a section called Build and deployment. Under Source, click the dropdown that says None and change it to Deploy from a branch. A second dropdown will appear — make sure it says main. Click Save.</w:t>
       </w:r>
     </w:p>
     <w:p>
       <w:pPr>
         <w:spacing w:after="80"/>
-        <w:ind w:left="360"/>
+        <w:ind w:left="432"/>
+        <w:shd w:val="clear" w:color="auto" w:fill="FEF9EC"/>
       </w:pPr>
       <w:r>
         <w:rPr>
@@ -1239,42 +1432,42 @@
           <w:color w:val="C8963E"/>
           <w:sz w:val="20"/>
         </w:rPr>
-        <w:t xml:space="preserve">→ Netlify Drop: </w:t>
+        <w:t xml:space="preserve">  Note: </w:t>
       </w:r>
       <w:r>
         <w:rPr>
           <w:b w:val="0"/>
-          <w:i/>
-          <w:color w:val="1B3A6B"/>
+          <w:i w:val="0"/>
+          <w:color w:val="78551F"/>
           <w:sz w:val="20"/>
         </w:rPr>
-        <w:t>https://app.netlify.com/drop</w:t>
+        <w:t xml:space="preserve">If you don't see 'main' in the branch dropdown, your files may be on a branch called 'master' instead — select that.  </w:t>
       </w:r>
     </w:p>
     <w:p>
       <w:pPr>
-        <w:spacing w:before="80" w:after="80"/>
+        <w:spacing w:before="60" w:after="60"/>
       </w:pPr>
       <w:r>
         <w:rPr>
           <w:color w:val="D1D5DB"/>
-          <w:sz w:val="16"/>
+          <w:sz w:val="14"/>
         </w:rPr>
-        <w:t>────────────────────────────────────────────────────────────────────────</w:t>
+        <w:t>──────────────────────────────────────────────────────────────────────────</w:t>
       </w:r>
     </w:p>
     <w:p>
       <w:pPr>
-        <w:spacing w:before="240" w:after="60"/>
+        <w:spacing w:before="200" w:after="60"/>
       </w:pPr>
       <w:r>
         <w:rPr>
           <w:b/>
           <w:i w:val="0"/>
           <w:color w:val="1B3A6B"/>
-          <w:sz w:val="23"/>
+          <w:sz w:val="24"/>
         </w:rPr>
-        <w:t xml:space="preserve">Step B2  </w:t>
+        <w:t xml:space="preserve">Step A6  </w:t>
       </w:r>
       <w:r>
         <w:rPr>
@@ -1290,48 +1483,75 @@
           <w:b/>
           <w:i w:val="0"/>
           <w:color w:val="1B3A6B"/>
-          <w:sz w:val="23"/>
+          <w:sz w:val="24"/>
         </w:rPr>
-        <w:t>Drag &amp; Drop Your Folder</w:t>
+        <w:t>Get Your Live URL</w:t>
       </w:r>
     </w:p>
     <w:p>
       <w:pPr>
-        <w:spacing w:before="40" w:after="120"/>
-        <w:ind w:left="360"/>
+        <w:spacing w:before="40" w:after="100"/>
+        <w:ind w:left="432"/>
       </w:pPr>
       <w:r>
         <w:rPr>
           <w:color w:val="1A1A2E"/>
           <w:sz w:val="21"/>
         </w:rPr>
-        <w:t>Drag your entire project folder (the one containing index.html, style.css, etc.) directly onto the Netlify Drop page. It will upload automatically and give you a live URL within seconds — e.g. https://random-name.netlify.app</w:t>
+        <w:t>After saving, wait about 2 minutes. Refresh the Settings → Pages page. You'll see a green banner that says:</w:t>
       </w:r>
     </w:p>
     <w:p>
       <w:pPr>
-        <w:spacing w:before="80" w:after="80"/>
+        <w:spacing w:after="120"/>
+        <w:ind w:left="576"/>
+      </w:pPr>
+      <w:r>
+        <w:rPr>
+          <w:b/>
+          <w:color w:val="2D6A4F"/>
+          <w:sz w:val="21"/>
+        </w:rPr>
+        <w:t>Your site is live at https://yourusername.github.io/my-campaign-site</w:t>
+      </w:r>
+    </w:p>
+    <w:p>
+      <w:pPr>
+        <w:spacing w:before="40" w:after="100"/>
+        <w:ind w:left="432"/>
+      </w:pPr>
+      <w:r>
+        <w:rPr>
+          <w:color w:val="1A1A2E"/>
+          <w:sz w:val="21"/>
+        </w:rPr>
+        <w:t>Click that link to visit your live website. Share it on social media, in emails, or on printed flyers — your site is now publicly accessible to anyone.</w:t>
+      </w:r>
+    </w:p>
+    <w:p>
+      <w:pPr>
+        <w:spacing w:before="60" w:after="60"/>
       </w:pPr>
       <w:r>
         <w:rPr>
           <w:color w:val="D1D5DB"/>
-          <w:sz w:val="16"/>
+          <w:sz w:val="14"/>
         </w:rPr>
-        <w:t>────────────────────────────────────────────────────────────────────────</w:t>
+        <w:t>──────────────────────────────────────────────────────────────────────────</w:t>
       </w:r>
     </w:p>
     <w:p>
       <w:pPr>
-        <w:spacing w:before="240" w:after="60"/>
+        <w:spacing w:before="200" w:after="60"/>
       </w:pPr>
       <w:r>
         <w:rPr>
           <w:b/>
           <w:i w:val="0"/>
           <w:color w:val="1B3A6B"/>
-          <w:sz w:val="23"/>
+          <w:sz w:val="24"/>
         </w:rPr>
-        <w:t xml:space="preserve">Step B3  </w:t>
+        <w:t xml:space="preserve">Step A7  </w:t>
       </w:r>
       <w:r>
         <w:rPr>
@@ -1347,248 +1567,967 @@
           <w:b/>
           <w:i w:val="0"/>
           <w:color w:val="1B3A6B"/>
-          <w:sz w:val="23"/>
+          <w:sz w:val="24"/>
         </w:rPr>
-        <w:t>Claim Your Site (Optional)</w:t>
+        <w:t>Updating Your Site Later</w:t>
       </w:r>
     </w:p>
     <w:p>
       <w:pPr>
-        <w:spacing w:before="40" w:after="120"/>
-        <w:ind w:left="360"/>
+        <w:spacing w:before="40" w:after="100"/>
+        <w:ind w:left="432"/>
       </w:pPr>
       <w:r>
         <w:rPr>
           <w:color w:val="1A1A2E"/>
           <w:sz w:val="21"/>
         </w:rPr>
-        <w:t>Create a free Netlify account to keep the site permanently, rename the URL, and connect a custom domain name (e.g. meenalbagla.com) later.</w:t>
+        <w:t>Whenever Claude Code makes changes to your files, you'll need to re-upload them to GitHub to update the live site. Go to your repository, click Add file → Upload files again, drag the updated files in (they'll replace the old ones), and commit. GitHub Pages will rebuild automatically within 1–2 minutes.</w:t>
       </w:r>
     </w:p>
     <w:p>
-      <w:pPr>
-        <w:spacing w:before="80" w:after="80"/>
-      </w:pPr>
       <w:r>
-        <w:rPr>
-          <w:color w:val="D1D5DB"/>
-          <w:sz w:val="16"/>
-        </w:rPr>
-        <w:t>────────────────────────────────────────────────────────────────────────</w:t>
+        <w:br w:type="page"/>
       </w:r>
     </w:p>
     <w:p>
       <w:pPr>
-        <w:spacing w:before="360" w:after="120"/>
+        <w:spacing w:before="240" w:after="200"/>
+        <w:shd w:val="clear" w:color="auto" w:fill="C8963E"/>
       </w:pPr>
       <w:r>
         <w:rPr>
           <w:b/>
+          <w:i w:val="0"/>
           <w:color w:val="1B3A6B"/>
-          <w:sz w:val="28"/>
+          <w:sz w:val="26"/>
         </w:rPr>
-        <w:t>Adding a Custom Domain Name (Optional)</w:t>
+        <w:t xml:space="preserve">  PART 4 — Buy a Custom Domain Name  </w:t>
       </w:r>
     </w:p>
     <w:p>
       <w:pPr>
-        <w:spacing w:before="40" w:after="120"/>
-        <w:ind w:left="360"/>
+        <w:spacing w:after="200"/>
+      </w:pPr>
+      <w:r>
+        <w:rPr>
+          <w:color w:val="6B7280"/>
+          <w:sz w:val="21"/>
+        </w:rPr>
+        <w:t>A custom domain like yourname.com or yourcampaign.com makes your site look professional and is easy to share. Domains typically cost $10–15/year. Two great options: Namecheap and Cloudflare Registrar.</w:t>
+      </w:r>
+    </w:p>
+    <w:p>
+      <w:pPr>
+        <w:spacing w:before="320" w:after="160"/>
+        <w:shd w:val="clear" w:color="auto" w:fill="FEF9EC"/>
+      </w:pPr>
+      <w:r>
+        <w:rPr>
+          <w:b/>
+          <w:i w:val="0"/>
+          <w:color w:val="78551F"/>
+          <w:sz w:val="22"/>
+        </w:rPr>
+        <w:t xml:space="preserve">  Option 1: Namecheap (Beginner-Friendly)  </w:t>
+      </w:r>
+    </w:p>
+    <w:p>
+      <w:pPr>
+        <w:spacing w:before="200" w:after="60"/>
+      </w:pPr>
+      <w:r>
+        <w:rPr>
+          <w:b/>
+          <w:i w:val="0"/>
+          <w:color w:val="1B3A6B"/>
+          <w:sz w:val="24"/>
+        </w:rPr>
+        <w:t xml:space="preserve">Step N1  </w:t>
+      </w:r>
+      <w:r>
+        <w:rPr>
+          <w:b/>
+          <w:i w:val="0"/>
+          <w:color w:val="C8963E"/>
+          <w:sz w:val="18"/>
+        </w:rPr>
+        <w:t xml:space="preserve">[Web]  </w:t>
+      </w:r>
+      <w:r>
+        <w:rPr>
+          <w:b/>
+          <w:i w:val="0"/>
+          <w:color w:val="1B3A6B"/>
+          <w:sz w:val="24"/>
+        </w:rPr>
+        <w:t>Search for Your Domain</w:t>
+      </w:r>
+    </w:p>
+    <w:p>
+      <w:pPr>
+        <w:spacing w:before="40" w:after="100"/>
+        <w:ind w:left="432"/>
       </w:pPr>
       <w:r>
         <w:rPr>
           <w:color w:val="1A1A2E"/>
           <w:sz w:val="21"/>
         </w:rPr>
-        <w:t>To use a custom URL like yourname.com or yourcampaign.com:</w:t>
+        <w:t>Go to namecheap.com. In the large search bar on the homepage, type the domain name you want — for example  meenalbagla.com  or  janesmith4belmont.com. Click Search. Namecheap will show you whether the name is available and its price. A .com domain typically costs $10–14 for the first year.</w:t>
       </w:r>
     </w:p>
     <w:p>
       <w:pPr>
-        <w:pStyle w:val="ListBullet"/>
-        <w:spacing w:before="20" w:after="60"/>
-        <w:ind w:left="576"/>
+        <w:spacing w:after="80"/>
+        <w:ind w:left="432"/>
+      </w:pPr>
+      <w:r>
+        <w:rPr>
+          <w:b/>
+          <w:i w:val="0"/>
+          <w:color w:val="C8963E"/>
+          <w:sz w:val="20"/>
+        </w:rPr>
+        <w:t xml:space="preserve">→ namecheap.com: </w:t>
+      </w:r>
+      <w:r>
+        <w:rPr>
+          <w:b w:val="0"/>
+          <w:i/>
+          <w:color w:val="1B3A6B"/>
+          <w:sz w:val="20"/>
+        </w:rPr>
+        <w:t>https://namecheap.com</w:t>
+      </w:r>
+    </w:p>
+    <w:p>
+      <w:pPr>
+        <w:spacing w:before="60" w:after="60"/>
+      </w:pPr>
+      <w:r>
+        <w:rPr>
+          <w:color w:val="D1D5DB"/>
+          <w:sz w:val="14"/>
+        </w:rPr>
+        <w:t>──────────────────────────────────────────────────────────────────────────</w:t>
+      </w:r>
+    </w:p>
+    <w:p>
+      <w:pPr>
+        <w:spacing w:before="200" w:after="60"/>
+      </w:pPr>
+      <w:r>
+        <w:rPr>
+          <w:b/>
+          <w:i w:val="0"/>
+          <w:color w:val="1B3A6B"/>
+          <w:sz w:val="24"/>
+        </w:rPr>
+        <w:t xml:space="preserve">Step N2  </w:t>
+      </w:r>
+      <w:r>
+        <w:rPr>
+          <w:b/>
+          <w:i w:val="0"/>
+          <w:color w:val="C8963E"/>
+          <w:sz w:val="18"/>
+        </w:rPr>
+        <w:t xml:space="preserve">[Web]  </w:t>
+      </w:r>
+      <w:r>
+        <w:rPr>
+          <w:b/>
+          <w:i w:val="0"/>
+          <w:color w:val="1B3A6B"/>
+          <w:sz w:val="24"/>
+        </w:rPr>
+        <w:t>Add to Cart and Check Out</w:t>
+      </w:r>
+    </w:p>
+    <w:p>
+      <w:pPr>
+        <w:spacing w:before="40" w:after="100"/>
+        <w:ind w:left="432"/>
       </w:pPr>
       <w:r>
         <w:rPr>
           <w:color w:val="1A1A2E"/>
           <w:sz w:val="21"/>
         </w:rPr>
-        <w:t>Purchase a domain from Namecheap, Google Domains, or Squarespace Domains (~$12–15/year).</w:t>
+        <w:t>Click Add to Cart next to the domain you want. Click the cart icon in the top-right and then View Cart. Uncheck any add-ons you don't need (WhoisGuard privacy is free and worth keeping). Click Confirm Order. Create a Namecheap account or log in, then enter your payment information and complete the purchase.</w:t>
       </w:r>
     </w:p>
     <w:p>
       <w:pPr>
-        <w:pStyle w:val="ListBullet"/>
-        <w:spacing w:before="20" w:after="60"/>
-        <w:ind w:left="576"/>
+        <w:spacing w:before="60" w:after="60"/>
+      </w:pPr>
+      <w:r>
+        <w:rPr>
+          <w:color w:val="D1D5DB"/>
+          <w:sz w:val="14"/>
+        </w:rPr>
+        <w:t>──────────────────────────────────────────────────────────────────────────</w:t>
+      </w:r>
+    </w:p>
+    <w:p>
+      <w:pPr>
+        <w:spacing w:before="200" w:after="60"/>
+      </w:pPr>
+      <w:r>
+        <w:rPr>
+          <w:b/>
+          <w:i w:val="0"/>
+          <w:color w:val="1B3A6B"/>
+          <w:sz w:val="24"/>
+        </w:rPr>
+        <w:t xml:space="preserve">Step N3  </w:t>
+      </w:r>
+      <w:r>
+        <w:rPr>
+          <w:b/>
+          <w:i w:val="0"/>
+          <w:color w:val="C8963E"/>
+          <w:sz w:val="18"/>
+        </w:rPr>
+        <w:t xml:space="preserve">[Web]  </w:t>
+      </w:r>
+      <w:r>
+        <w:rPr>
+          <w:b/>
+          <w:i w:val="0"/>
+          <w:color w:val="1B3A6B"/>
+          <w:sz w:val="24"/>
+        </w:rPr>
+        <w:t>Find Your DNS Settings</w:t>
+      </w:r>
+    </w:p>
+    <w:p>
+      <w:pPr>
+        <w:spacing w:before="40" w:after="100"/>
+        <w:ind w:left="432"/>
       </w:pPr>
       <w:r>
         <w:rPr>
           <w:color w:val="1A1A2E"/>
           <w:sz w:val="21"/>
         </w:rPr>
-        <w:t>In your GitHub Pages or Netlify settings, find the Custom Domain field and enter your domain.</w:t>
+        <w:t>After purchase, log in to namecheap.com and go to Account → Dashboard. Click Domain List in the left sidebar. Find your domain and click Manage. Click the Advanced DNS tab. This is where you'll add the records that point your domain to your GitHub Pages site.</w:t>
       </w:r>
     </w:p>
     <w:p>
       <w:pPr>
-        <w:pStyle w:val="ListBullet"/>
-        <w:spacing w:before="20" w:after="60"/>
-        <w:ind w:left="576"/>
+        <w:spacing w:before="60" w:after="60"/>
+      </w:pPr>
+      <w:r>
+        <w:rPr>
+          <w:color w:val="D1D5DB"/>
+          <w:sz w:val="14"/>
+        </w:rPr>
+        <w:t>──────────────────────────────────────────────────────────────────────────</w:t>
+      </w:r>
+    </w:p>
+    <w:p>
+      <w:pPr>
+        <w:spacing w:before="200" w:after="60"/>
+      </w:pPr>
+      <w:r>
+        <w:rPr>
+          <w:b/>
+          <w:i w:val="0"/>
+          <w:color w:val="1B3A6B"/>
+          <w:sz w:val="24"/>
+        </w:rPr>
+        <w:t xml:space="preserve">Step N4  </w:t>
+      </w:r>
+      <w:r>
+        <w:rPr>
+          <w:b/>
+          <w:i w:val="0"/>
+          <w:color w:val="C8963E"/>
+          <w:sz w:val="18"/>
+        </w:rPr>
+        <w:t xml:space="preserve">[Web]  </w:t>
+      </w:r>
+      <w:r>
+        <w:rPr>
+          <w:b/>
+          <w:i w:val="0"/>
+          <w:color w:val="1B3A6B"/>
+          <w:sz w:val="24"/>
+        </w:rPr>
+        <w:t>Add GitHub Pages DNS Records</w:t>
+      </w:r>
+    </w:p>
+    <w:p>
+      <w:pPr>
+        <w:spacing w:before="40" w:after="100"/>
+        <w:ind w:left="432"/>
       </w:pPr>
       <w:r>
         <w:rPr>
           <w:color w:val="1A1A2E"/>
           <w:sz w:val="21"/>
         </w:rPr>
-        <w:t>In your domain registrar's DNS settings, point the domain to GitHub or Netlify using the nameservers or CNAME/A records they provide. Both services have step-by-step guides.</w:t>
+        <w:t>In Advanced DNS, delete any existing A records that are already there, then add the following records. Click Add New Record for each one:</w:t>
       </w:r>
     </w:p>
     <w:p>
       <w:pPr>
-        <w:pStyle w:val="ListBullet"/>
-        <w:spacing w:before="20" w:after="60"/>
-        <w:ind w:left="576"/>
+        <w:spacing w:before="40" w:after="100"/>
+        <w:ind w:left="288"/>
       </w:pPr>
       <w:r>
         <w:rPr>
           <w:color w:val="1A1A2E"/>
           <w:sz w:val="21"/>
         </w:rPr>
-        <w:t>DNS changes take 15 minutes to 24 hours to fully propagate.</w:t>
+        <w:t>Add four A Records (one for each GitHub IP address):</w:t>
       </w:r>
     </w:p>
     <w:p>
       <w:pPr>
-        <w:spacing w:before="360" w:after="120"/>
-      </w:pPr>
-      <w:r>
-        <w:rPr>
-          <w:b/>
-          <w:color w:val="1B3A6B"/>
-          <w:sz w:val="28"/>
-        </w:rPr>
-        <w:t>Receiving Form Submissions (Optional)</w:t>
-      </w:r>
-    </w:p>
-    <w:p>
-      <w:pPr>
-        <w:spacing w:before="40" w:after="120"/>
-        <w:ind w:left="360"/>
+        <w:pStyle w:val="ListBullet"/>
+        <w:spacing w:before="20" w:after="60"/>
+        <w:ind w:left="648"/>
       </w:pPr>
       <w:r>
         <w:rPr>
           <w:color w:val="1A1A2E"/>
           <w:sz w:val="21"/>
         </w:rPr>
-        <w:t>The contact form on your site can be connected to a free service so you receive emails when someone submits it:</w:t>
+        <w:t>Type: A Record  |  Host: @  |  Value: 185.199.108.153  |  TTL: Automatic</w:t>
       </w:r>
     </w:p>
     <w:p>
       <w:pPr>
         <w:pStyle w:val="ListBullet"/>
         <w:spacing w:before="20" w:after="60"/>
-        <w:ind w:left="576"/>
+        <w:ind w:left="648"/>
+      </w:pPr>
+      <w:r>
+        <w:rPr>
+          <w:color w:val="1A1A2E"/>
+          <w:sz w:val="21"/>
+        </w:rPr>
+        <w:t>Type: A Record  |  Host: @  |  Value: 185.199.109.153  |  TTL: Automatic</w:t>
+      </w:r>
+    </w:p>
+    <w:p>
+      <w:pPr>
+        <w:pStyle w:val="ListBullet"/>
+        <w:spacing w:before="20" w:after="60"/>
+        <w:ind w:left="648"/>
+      </w:pPr>
+      <w:r>
+        <w:rPr>
+          <w:color w:val="1A1A2E"/>
+          <w:sz w:val="21"/>
+        </w:rPr>
+        <w:t>Type: A Record  |  Host: @  |  Value: 185.199.110.153  |  TTL: Automatic</w:t>
+      </w:r>
+    </w:p>
+    <w:p>
+      <w:pPr>
+        <w:pStyle w:val="ListBullet"/>
+        <w:spacing w:before="20" w:after="60"/>
+        <w:ind w:left="648"/>
+      </w:pPr>
+      <w:r>
+        <w:rPr>
+          <w:color w:val="1A1A2E"/>
+          <w:sz w:val="21"/>
+        </w:rPr>
+        <w:t>Type: A Record  |  Host: @  |  Value: 185.199.111.153  |  TTL: Automatic</w:t>
+      </w:r>
+    </w:p>
+    <w:p>
+      <w:pPr>
+        <w:spacing w:before="40" w:after="100"/>
+        <w:ind w:left="288"/>
+      </w:pPr>
+      <w:r>
+        <w:rPr>
+          <w:color w:val="1A1A2E"/>
+          <w:sz w:val="21"/>
+        </w:rPr>
+        <w:t>Add one CNAME Record:</w:t>
+      </w:r>
+    </w:p>
+    <w:p>
+      <w:pPr>
+        <w:pStyle w:val="ListBullet"/>
+        <w:spacing w:before="20" w:after="60"/>
+        <w:ind w:left="648"/>
+      </w:pPr>
+      <w:r>
+        <w:rPr>
+          <w:color w:val="1A1A2E"/>
+          <w:sz w:val="21"/>
+        </w:rPr>
+        <w:t>Type: CNAME Record  |  Host: www  |  Value: yourusername.github.io  |  TTL: Automatic</w:t>
+      </w:r>
+    </w:p>
+    <w:p>
+      <w:pPr>
+        <w:spacing w:before="40" w:after="100"/>
+        <w:ind w:left="432"/>
+      </w:pPr>
+      <w:r>
+        <w:rPr>
+          <w:color w:val="1A1A2E"/>
+          <w:sz w:val="21"/>
+        </w:rPr>
+        <w:t>Replace  yourusername  with your actual GitHub username. Click the checkmark to save each record.</w:t>
+      </w:r>
+    </w:p>
+    <w:p>
+      <w:pPr>
+        <w:spacing w:after="80"/>
+        <w:ind w:left="432"/>
+        <w:shd w:val="clear" w:color="auto" w:fill="FEF9EC"/>
+      </w:pPr>
+      <w:r>
+        <w:rPr>
+          <w:b/>
+          <w:i w:val="0"/>
+          <w:color w:val="C8963E"/>
+          <w:sz w:val="20"/>
+        </w:rPr>
+        <w:t xml:space="preserve">  Note: </w:t>
+      </w:r>
+      <w:r>
+        <w:rPr>
+          <w:b w:val="0"/>
+          <w:i w:val="0"/>
+          <w:color w:val="78551F"/>
+          <w:sz w:val="20"/>
+        </w:rPr>
+        <w:t xml:space="preserve">DNS changes can take 15 minutes to 24 hours to fully take effect across the internet.  </w:t>
+      </w:r>
+    </w:p>
+    <w:p>
+      <w:pPr>
+        <w:spacing w:before="60" w:after="60"/>
+      </w:pPr>
+      <w:r>
+        <w:rPr>
+          <w:color w:val="D1D5DB"/>
+          <w:sz w:val="14"/>
+        </w:rPr>
+        <w:t>──────────────────────────────────────────────────────────────────────────</w:t>
+      </w:r>
+    </w:p>
+    <w:p>
+      <w:pPr>
+        <w:spacing w:before="200" w:after="60"/>
       </w:pPr>
       <w:r>
         <w:rPr>
           <w:b/>
           <w:i w:val="0"/>
           <w:color w:val="1B3A6B"/>
+          <w:sz w:val="24"/>
+        </w:rPr>
+        <w:t xml:space="preserve">Step N5  </w:t>
+      </w:r>
+      <w:r>
+        <w:rPr>
+          <w:b/>
+          <w:i w:val="0"/>
+          <w:color w:val="C8963E"/>
+          <w:sz w:val="18"/>
+        </w:rPr>
+        <w:t xml:space="preserve">[Web]  </w:t>
+      </w:r>
+      <w:r>
+        <w:rPr>
+          <w:b/>
+          <w:i w:val="0"/>
+          <w:color w:val="1B3A6B"/>
+          <w:sz w:val="24"/>
+        </w:rPr>
+        <w:t>Connect Domain in GitHub Pages</w:t>
+      </w:r>
+    </w:p>
+    <w:p>
+      <w:pPr>
+        <w:spacing w:before="40" w:after="100"/>
+        <w:ind w:left="432"/>
+      </w:pPr>
+      <w:r>
+        <w:rPr>
+          <w:color w:val="1A1A2E"/>
           <w:sz w:val="21"/>
         </w:rPr>
-        <w:t xml:space="preserve">Formspree: </w:t>
+        <w:t>Go back to your GitHub repository. Click Settings → Pages. In the Custom domain field, type your domain name exactly as purchased (e.g. meenalbagla.com) and click Save. Check the box for Enforce HTTPS if it appears. GitHub will verify your domain — this may take a few minutes. Once verified, your site will be accessible at your custom domain.</w:t>
+      </w:r>
+    </w:p>
+    <w:p>
+      <w:pPr>
+        <w:spacing w:before="320" w:after="0"/>
+      </w:pPr>
+    </w:p>
+    <w:p>
+      <w:pPr>
+        <w:spacing w:before="320" w:after="160"/>
+        <w:shd w:val="clear" w:color="auto" w:fill="E8F0FE"/>
+      </w:pPr>
+      <w:r>
+        <w:rPr>
+          <w:b/>
+          <w:i w:val="0"/>
+          <w:color w:val="1B3A6B"/>
+          <w:sz w:val="22"/>
+        </w:rPr>
+        <w:t xml:space="preserve">  Option 2: Cloudflare Registrar (Best Price + Security)  </w:t>
+      </w:r>
+    </w:p>
+    <w:p>
+      <w:pPr>
+        <w:spacing w:before="200" w:after="60"/>
+      </w:pPr>
+      <w:r>
+        <w:rPr>
+          <w:b/>
+          <w:i w:val="0"/>
+          <w:color w:val="1B3A6B"/>
+          <w:sz w:val="24"/>
+        </w:rPr>
+        <w:t xml:space="preserve">Step C1  </w:t>
+      </w:r>
+      <w:r>
+        <w:rPr>
+          <w:b/>
+          <w:i w:val="0"/>
+          <w:color w:val="C8963E"/>
+          <w:sz w:val="18"/>
+        </w:rPr>
+        <w:t xml:space="preserve">[Web]  </w:t>
+      </w:r>
+      <w:r>
+        <w:rPr>
+          <w:b/>
+          <w:i w:val="0"/>
+          <w:color w:val="1B3A6B"/>
+          <w:sz w:val="24"/>
+        </w:rPr>
+        <w:t>Create a Cloudflare Account</w:t>
+      </w:r>
+    </w:p>
+    <w:p>
+      <w:pPr>
+        <w:spacing w:before="40" w:after="100"/>
+        <w:ind w:left="432"/>
+      </w:pPr>
+      <w:r>
+        <w:rPr>
+          <w:color w:val="1A1A2E"/>
+          <w:sz w:val="21"/>
+        </w:rPr>
+        <w:t>Go to cloudflare.com and click Sign Up. Enter your email and create a password. Cloudflare is both a domain registrar and a security/performance layer — it gives you DNS management, free HTTPS, and DDoS protection automatically.</w:t>
+      </w:r>
+    </w:p>
+    <w:p>
+      <w:pPr>
+        <w:spacing w:after="80"/>
+        <w:ind w:left="432"/>
+      </w:pPr>
+      <w:r>
+        <w:rPr>
+          <w:b/>
+          <w:i w:val="0"/>
+          <w:color w:val="C8963E"/>
+          <w:sz w:val="20"/>
+        </w:rPr>
+        <w:t xml:space="preserve">→ cloudflare.com: </w:t>
+      </w:r>
+      <w:r>
+        <w:rPr>
+          <w:b w:val="0"/>
+          <w:i/>
+          <w:color w:val="1B3A6B"/>
+          <w:sz w:val="20"/>
+        </w:rPr>
+        <w:t>https://cloudflare.com</w:t>
+      </w:r>
+    </w:p>
+    <w:p>
+      <w:pPr>
+        <w:spacing w:before="60" w:after="60"/>
+      </w:pPr>
+      <w:r>
+        <w:rPr>
+          <w:color w:val="D1D5DB"/>
+          <w:sz w:val="14"/>
+        </w:rPr>
+        <w:t>──────────────────────────────────────────────────────────────────────────</w:t>
+      </w:r>
+    </w:p>
+    <w:p>
+      <w:pPr>
+        <w:spacing w:before="200" w:after="60"/>
+      </w:pPr>
+      <w:r>
+        <w:rPr>
+          <w:b/>
+          <w:i w:val="0"/>
+          <w:color w:val="1B3A6B"/>
+          <w:sz w:val="24"/>
+        </w:rPr>
+        <w:t xml:space="preserve">Step C2  </w:t>
+      </w:r>
+      <w:r>
+        <w:rPr>
+          <w:b/>
+          <w:i w:val="0"/>
+          <w:color w:val="C8963E"/>
+          <w:sz w:val="18"/>
+        </w:rPr>
+        <w:t xml:space="preserve">[Web]  </w:t>
+      </w:r>
+      <w:r>
+        <w:rPr>
+          <w:b/>
+          <w:i w:val="0"/>
+          <w:color w:val="1B3A6B"/>
+          <w:sz w:val="24"/>
+        </w:rPr>
+        <w:t>Register Your Domain</w:t>
+      </w:r>
+    </w:p>
+    <w:p>
+      <w:pPr>
+        <w:spacing w:before="40" w:after="100"/>
+        <w:ind w:left="432"/>
+      </w:pPr>
+      <w:r>
+        <w:rPr>
+          <w:color w:val="1A1A2E"/>
+          <w:sz w:val="21"/>
+        </w:rPr>
+        <w:t>In your Cloudflare dashboard, click the Domain Registration tab in the left sidebar, then click Register Domains. Search for your desired domain name. Cloudflare sells domains at wholesale cost (no markup) — a .com is typically $9.77/year. Select your domain and complete the purchase with a credit or debit card.</w:t>
+      </w:r>
+    </w:p>
+    <w:p>
+      <w:pPr>
+        <w:spacing w:before="60" w:after="60"/>
+      </w:pPr>
+      <w:r>
+        <w:rPr>
+          <w:color w:val="D1D5DB"/>
+          <w:sz w:val="14"/>
+        </w:rPr>
+        <w:t>──────────────────────────────────────────────────────────────────────────</w:t>
+      </w:r>
+    </w:p>
+    <w:p>
+      <w:pPr>
+        <w:spacing w:before="200" w:after="60"/>
+      </w:pPr>
+      <w:r>
+        <w:rPr>
+          <w:b/>
+          <w:i w:val="0"/>
+          <w:color w:val="1B3A6B"/>
+          <w:sz w:val="24"/>
+        </w:rPr>
+        <w:t xml:space="preserve">Step C3  </w:t>
+      </w:r>
+      <w:r>
+        <w:rPr>
+          <w:b/>
+          <w:i w:val="0"/>
+          <w:color w:val="C8963E"/>
+          <w:sz w:val="18"/>
+        </w:rPr>
+        <w:t xml:space="preserve">[Web]  </w:t>
+      </w:r>
+      <w:r>
+        <w:rPr>
+          <w:b/>
+          <w:i w:val="0"/>
+          <w:color w:val="1B3A6B"/>
+          <w:sz w:val="24"/>
+        </w:rPr>
+        <w:t>Add DNS Records in Cloudflare</w:t>
+      </w:r>
+    </w:p>
+    <w:p>
+      <w:pPr>
+        <w:spacing w:before="40" w:after="100"/>
+        <w:ind w:left="432"/>
+      </w:pPr>
+      <w:r>
+        <w:rPr>
+          <w:color w:val="1A1A2E"/>
+          <w:sz w:val="21"/>
+        </w:rPr>
+        <w:t>After purchasing, your domain will appear in your Cloudflare dashboard. Click on your domain name, then click DNS in the left sidebar. Click Add record for each of the following:</w:t>
+      </w:r>
+    </w:p>
+    <w:p>
+      <w:pPr>
+        <w:spacing w:before="40" w:after="100"/>
+        <w:ind w:left="288"/>
+      </w:pPr>
+      <w:r>
+        <w:rPr>
+          <w:color w:val="1A1A2E"/>
+          <w:sz w:val="21"/>
+        </w:rPr>
+        <w:t>Add four A Records:</w:t>
+      </w:r>
+    </w:p>
+    <w:p>
+      <w:pPr>
+        <w:pStyle w:val="ListBullet"/>
+        <w:spacing w:before="20" w:after="60"/>
+        <w:ind w:left="648"/>
+      </w:pPr>
+      <w:r>
+        <w:rPr>
+          <w:color w:val="1A1A2E"/>
+          <w:sz w:val="21"/>
+        </w:rPr>
+        <w:t>Type: A  |  Name: @  |  IPv4: 185.199.108.153  |  Proxy: DNS only (grey cloud)</w:t>
+      </w:r>
+    </w:p>
+    <w:p>
+      <w:pPr>
+        <w:pStyle w:val="ListBullet"/>
+        <w:spacing w:before="20" w:after="60"/>
+        <w:ind w:left="648"/>
+      </w:pPr>
+      <w:r>
+        <w:rPr>
+          <w:color w:val="1A1A2E"/>
+          <w:sz w:val="21"/>
+        </w:rPr>
+        <w:t>Type: A  |  Name: @  |  IPv4: 185.199.109.153  |  Proxy: DNS only (grey cloud)</w:t>
+      </w:r>
+    </w:p>
+    <w:p>
+      <w:pPr>
+        <w:pStyle w:val="ListBullet"/>
+        <w:spacing w:before="20" w:after="60"/>
+        <w:ind w:left="648"/>
+      </w:pPr>
+      <w:r>
+        <w:rPr>
+          <w:color w:val="1A1A2E"/>
+          <w:sz w:val="21"/>
+        </w:rPr>
+        <w:t>Type: A  |  Name: @  |  IPv4: 185.199.110.153  |  Proxy: DNS only (grey cloud)</w:t>
+      </w:r>
+    </w:p>
+    <w:p>
+      <w:pPr>
+        <w:pStyle w:val="ListBullet"/>
+        <w:spacing w:before="20" w:after="60"/>
+        <w:ind w:left="648"/>
+      </w:pPr>
+      <w:r>
+        <w:rPr>
+          <w:color w:val="1A1A2E"/>
+          <w:sz w:val="21"/>
+        </w:rPr>
+        <w:t>Type: A  |  Name: @  |  IPv4: 185.199.111.153  |  Proxy: DNS only (grey cloud)</w:t>
+      </w:r>
+    </w:p>
+    <w:p>
+      <w:pPr>
+        <w:spacing w:before="40" w:after="100"/>
+        <w:ind w:left="288"/>
+      </w:pPr>
+      <w:r>
+        <w:rPr>
+          <w:color w:val="1A1A2E"/>
+          <w:sz w:val="21"/>
+        </w:rPr>
+        <w:t>Add one CNAME Record:</w:t>
+      </w:r>
+    </w:p>
+    <w:p>
+      <w:pPr>
+        <w:pStyle w:val="ListBullet"/>
+        <w:spacing w:before="20" w:after="60"/>
+        <w:ind w:left="648"/>
+      </w:pPr>
+      <w:r>
+        <w:rPr>
+          <w:color w:val="1A1A2E"/>
+          <w:sz w:val="21"/>
+        </w:rPr>
+        <w:t>Type: CNAME  |  Name: www  |  Target: yourusername.github.io  |  Proxy: DNS only</w:t>
+      </w:r>
+    </w:p>
+    <w:p>
+      <w:pPr>
+        <w:spacing w:after="80"/>
+        <w:ind w:left="432"/>
+        <w:shd w:val="clear" w:color="auto" w:fill="FEF9EC"/>
+      </w:pPr>
+      <w:r>
+        <w:rPr>
+          <w:b/>
+          <w:i w:val="0"/>
+          <w:color w:val="C8963E"/>
+          <w:sz w:val="20"/>
+        </w:rPr>
+        <w:t xml:space="preserve">  Note: </w:t>
       </w:r>
       <w:r>
         <w:rPr>
           <w:b w:val="0"/>
           <w:i w:val="0"/>
-          <w:color w:val="1A1A2E"/>
-          <w:sz w:val="21"/>
+          <w:color w:val="78551F"/>
+          <w:sz w:val="20"/>
         </w:rPr>
-        <w:t>Go to formspree.io and create a free account.</w:t>
+        <w:t xml:space="preserve">Set each record to 'DNS only' (grey cloud icon), NOT 'Proxied' (orange cloud). Proxied mode can interfere with GitHub Pages SSL certificate verification.  </w:t>
       </w:r>
     </w:p>
     <w:p>
       <w:pPr>
-        <w:pStyle w:val="ListBullet"/>
-        <w:spacing w:before="20" w:after="60"/>
-        <w:ind w:left="576"/>
+        <w:spacing w:before="60" w:after="60"/>
+      </w:pPr>
+      <w:r>
+        <w:rPr>
+          <w:color w:val="D1D5DB"/>
+          <w:sz w:val="14"/>
+        </w:rPr>
+        <w:t>──────────────────────────────────────────────────────────────────────────</w:t>
+      </w:r>
+    </w:p>
+    <w:p>
+      <w:pPr>
+        <w:spacing w:before="200" w:after="60"/>
       </w:pPr>
       <w:r>
         <w:rPr>
           <w:b/>
           <w:i w:val="0"/>
           <w:color w:val="1B3A6B"/>
-          <w:sz w:val="21"/>
+          <w:sz w:val="24"/>
         </w:rPr>
-        <w:t xml:space="preserve">Create form: </w:t>
+        <w:t xml:space="preserve">Step C4  </w:t>
       </w:r>
       <w:r>
         <w:rPr>
-          <w:b w:val="0"/>
+          <w:b/>
           <w:i w:val="0"/>
-          <w:color w:val="1A1A2E"/>
-          <w:sz w:val="21"/>
+          <w:color w:val="C8963E"/>
+          <w:sz w:val="18"/>
         </w:rPr>
-        <w:t>Create a new form — Formspree gives you a unique endpoint URL.</w:t>
+        <w:t xml:space="preserve">[Web]  </w:t>
       </w:r>
-    </w:p>
-    <w:p>
-      <w:pPr>
-        <w:pStyle w:val="ListBullet"/>
-        <w:spacing w:before="20" w:after="60"/>
-        <w:ind w:left="576"/>
-      </w:pPr>
       <w:r>
         <w:rPr>
           <w:b/>
           <w:i w:val="0"/>
           <w:color w:val="1B3A6B"/>
-          <w:sz w:val="21"/>
+          <w:sz w:val="24"/>
         </w:rPr>
-        <w:t xml:space="preserve">Connect: </w:t>
+        <w:t>Connect Domain in GitHub Pages</w:t>
       </w:r>
+    </w:p>
+    <w:p>
+      <w:pPr>
+        <w:spacing w:before="40" w:after="100"/>
+        <w:ind w:left="432"/>
+      </w:pPr>
       <w:r>
         <w:rPr>
-          <w:b w:val="0"/>
-          <w:i w:val="0"/>
           <w:color w:val="1A1A2E"/>
           <w:sz w:val="21"/>
         </w:rPr>
-        <w:t>In your index.html, find the &lt;form&gt; tag and set action="https://formspree.io/f/YOUR_ID".</w:t>
+        <w:t>Go to your GitHub repository → Settings → Pages. In the Custom domain field, type your domain (e.g. meenalbagla.com) and click Save. Enable Enforce HTTPS once GitHub verifies your domain. Your site will be live at your custom domain within minutes to a few hours.</w:t>
       </w:r>
     </w:p>
     <w:p>
-      <w:pPr>
-        <w:pStyle w:val="ListBullet"/>
-        <w:spacing w:before="20" w:after="60"/>
-        <w:ind w:left="576"/>
+      <w:r>
+        <w:br w:type="page"/>
+      </w:r>
+    </w:p>
+    <w:p>
+      <w:pPr>
+        <w:spacing w:before="240" w:after="200"/>
+        <w:shd w:val="clear" w:color="auto" w:fill="2D6A4F"/>
+      </w:pPr>
+      <w:r>
+        <w:rPr>
+          <w:b/>
+          <w:i w:val="0"/>
+          <w:color w:val="FFFFFF"/>
+          <w:sz w:val="26"/>
+        </w:rPr>
+        <w:t xml:space="preserve">  PART 5 — Optional Extras  </w:t>
+      </w:r>
+    </w:p>
+    <w:p>
+      <w:pPr>
+        <w:spacing w:before="320" w:after="160"/>
+        <w:shd w:val="clear" w:color="auto" w:fill="E8F4F0"/>
+      </w:pPr>
+      <w:r>
+        <w:rPr>
+          <w:b/>
+          <w:i w:val="0"/>
+          <w:color w:val="2D6A4F"/>
+          <w:sz w:val="22"/>
+        </w:rPr>
+        <w:t xml:space="preserve">  Receive Contact Form Submissions by Email  </w:t>
+      </w:r>
+    </w:p>
+    <w:p>
+      <w:pPr>
+        <w:spacing w:before="200" w:after="60"/>
       </w:pPr>
       <w:r>
         <w:rPr>
           <w:b/>
           <w:i w:val="0"/>
           <w:color w:val="1B3A6B"/>
-          <w:sz w:val="21"/>
+          <w:sz w:val="24"/>
         </w:rPr>
-        <w:t xml:space="preserve">Test: </w:t>
+        <w:t xml:space="preserve">Step F1  </w:t>
       </w:r>
       <w:r>
         <w:rPr>
-          <w:b w:val="0"/>
+          <w:b/>
           <w:i w:val="0"/>
+          <w:color w:val="C8963E"/>
+          <w:sz w:val="18"/>
+        </w:rPr>
+        <w:t xml:space="preserve">[Web]  </w:t>
+      </w:r>
+      <w:r>
+        <w:rPr>
+          <w:b/>
+          <w:i w:val="0"/>
+          <w:color w:val="1B3A6B"/>
+          <w:sz w:val="24"/>
+        </w:rPr>
+        <w:t>Sign Up for Formspree</w:t>
+      </w:r>
+    </w:p>
+    <w:p>
+      <w:pPr>
+        <w:spacing w:before="40" w:after="100"/>
+        <w:ind w:left="432"/>
+      </w:pPr>
+      <w:r>
+        <w:rPr>
           <w:color w:val="1A1A2E"/>
           <w:sz w:val="21"/>
         </w:rPr>
-        <w:t>Test by submitting the form. Responses will arrive in your email inbox.</w:t>
+        <w:t>Go to formspree.io and create a free account. Formspree receives form submissions from your website and forwards them to your email inbox — no server needed.</w:t>
       </w:r>
     </w:p>
     <w:p>
       <w:pPr>
         <w:spacing w:after="80"/>
-        <w:ind w:left="360"/>
+        <w:ind w:left="432"/>
       </w:pPr>
       <w:r>
         <w:rPr>
@@ -1610,18 +2549,388 @@
       </w:r>
     </w:p>
     <w:p>
+      <w:pPr>
+        <w:spacing w:before="60" w:after="60"/>
+      </w:pPr>
+      <w:r>
+        <w:rPr>
+          <w:color w:val="D1D5DB"/>
+          <w:sz w:val="14"/>
+        </w:rPr>
+        <w:t>──────────────────────────────────────────────────────────────────────────</w:t>
+      </w:r>
+    </w:p>
+    <w:p>
+      <w:pPr>
+        <w:spacing w:before="200" w:after="60"/>
+      </w:pPr>
+      <w:r>
+        <w:rPr>
+          <w:b/>
+          <w:i w:val="0"/>
+          <w:color w:val="1B3A6B"/>
+          <w:sz w:val="24"/>
+        </w:rPr>
+        <w:t xml:space="preserve">Step F2  </w:t>
+      </w:r>
+      <w:r>
+        <w:rPr>
+          <w:b/>
+          <w:i w:val="0"/>
+          <w:color w:val="C8963E"/>
+          <w:sz w:val="18"/>
+        </w:rPr>
+        <w:t xml:space="preserve">[Web]  </w:t>
+      </w:r>
+      <w:r>
+        <w:rPr>
+          <w:b/>
+          <w:i w:val="0"/>
+          <w:color w:val="1B3A6B"/>
+          <w:sz w:val="24"/>
+        </w:rPr>
+        <w:t>Create a New Form</w:t>
+      </w:r>
+    </w:p>
+    <w:p>
+      <w:pPr>
+        <w:spacing w:before="40" w:after="100"/>
+        <w:ind w:left="432"/>
+      </w:pPr>
+      <w:r>
+        <w:rPr>
+          <w:color w:val="1A1A2E"/>
+          <w:sz w:val="21"/>
+        </w:rPr>
+        <w:t>In your Formspree dashboard, click New Form. Give it a name (e.g. Campaign Contact Form) and enter your email address. Formspree will generate a unique form endpoint URL that looks like:  https://formspree.io/f/abcdefgh</w:t>
+      </w:r>
+    </w:p>
+    <w:p>
+      <w:pPr>
+        <w:spacing w:before="60" w:after="60"/>
+      </w:pPr>
+      <w:r>
+        <w:rPr>
+          <w:color w:val="D1D5DB"/>
+          <w:sz w:val="14"/>
+        </w:rPr>
+        <w:t>──────────────────────────────────────────────────────────────────────────</w:t>
+      </w:r>
+    </w:p>
+    <w:p>
+      <w:pPr>
+        <w:spacing w:before="200" w:after="60"/>
+      </w:pPr>
+      <w:r>
+        <w:rPr>
+          <w:b/>
+          <w:i w:val="0"/>
+          <w:color w:val="1B3A6B"/>
+          <w:sz w:val="24"/>
+        </w:rPr>
+        <w:t xml:space="preserve">Step F3  </w:t>
+      </w:r>
+      <w:r>
+        <w:rPr>
+          <w:b/>
+          <w:i w:val="0"/>
+          <w:color w:val="C8963E"/>
+          <w:sz w:val="18"/>
+        </w:rPr>
+        <w:t xml:space="preserve">[IDE]  </w:t>
+      </w:r>
+      <w:r>
+        <w:rPr>
+          <w:b/>
+          <w:i w:val="0"/>
+          <w:color w:val="1B3A6B"/>
+          <w:sz w:val="24"/>
+        </w:rPr>
+        <w:t>Connect the Form to Your Website</w:t>
+      </w:r>
+    </w:p>
+    <w:p>
+      <w:pPr>
+        <w:spacing w:before="40" w:after="100"/>
+        <w:ind w:left="432"/>
+      </w:pPr>
+      <w:r>
+        <w:rPr>
+          <w:color w:val="1A1A2E"/>
+          <w:sz w:val="21"/>
+        </w:rPr>
+        <w:t>Open your Claude Code panel and type:</w:t>
+      </w:r>
+    </w:p>
+    <w:p>
+      <w:pPr>
+        <w:ind w:left="576"/>
+      </w:pPr>
+      <w:r>
+        <w:rPr>
+          <w:i/>
+          <w:color w:val="6B7280"/>
+          <w:sz w:val="20"/>
+        </w:rPr>
+        <w:t>"Update the contact form's action attribute to https://formspree.io/f/YOUR_ID"</w:t>
+      </w:r>
+    </w:p>
+    <w:p>
+      <w:pPr>
+        <w:spacing w:before="40" w:after="100"/>
+        <w:ind w:left="432"/>
+      </w:pPr>
+      <w:r>
+        <w:rPr>
+          <w:color w:val="1A1A2E"/>
+          <w:sz w:val="21"/>
+        </w:rPr>
+        <w:t>Replace YOUR_ID with the actual ID from Formspree. Claude Code will update the HTML for you. Re-upload the updated index.html to GitHub as described in Part 3.</w:t>
+      </w:r>
+    </w:p>
+    <w:p>
+      <w:pPr>
+        <w:spacing w:before="60" w:after="60"/>
+      </w:pPr>
+      <w:r>
+        <w:rPr>
+          <w:color w:val="D1D5DB"/>
+          <w:sz w:val="14"/>
+        </w:rPr>
+        <w:t>──────────────────────────────────────────────────────────────────────────</w:t>
+      </w:r>
+    </w:p>
+    <w:p>
+      <w:pPr>
+        <w:spacing w:before="200" w:after="60"/>
+      </w:pPr>
+      <w:r>
+        <w:rPr>
+          <w:b/>
+          <w:i w:val="0"/>
+          <w:color w:val="1B3A6B"/>
+          <w:sz w:val="24"/>
+        </w:rPr>
+        <w:t xml:space="preserve">Step F4  </w:t>
+      </w:r>
+      <w:r>
+        <w:rPr>
+          <w:b/>
+          <w:i w:val="0"/>
+          <w:color w:val="C8963E"/>
+          <w:sz w:val="18"/>
+        </w:rPr>
+        <w:t xml:space="preserve">[Web]  </w:t>
+      </w:r>
+      <w:r>
+        <w:rPr>
+          <w:b/>
+          <w:i w:val="0"/>
+          <w:color w:val="1B3A6B"/>
+          <w:sz w:val="24"/>
+        </w:rPr>
+        <w:t>Test It</w:t>
+      </w:r>
+    </w:p>
+    <w:p>
+      <w:pPr>
+        <w:spacing w:before="40" w:after="100"/>
+        <w:ind w:left="432"/>
+      </w:pPr>
+      <w:r>
+        <w:rPr>
+          <w:color w:val="1A1A2E"/>
+          <w:sz w:val="21"/>
+        </w:rPr>
+        <w:t>Visit your live site, fill in the contact form, and click Submit. Check your email — you should receive the submission within a minute. All future form submissions will arrive directly in your inbox.</w:t>
+      </w:r>
+    </w:p>
+    <w:p>
+      <w:pPr>
+        <w:spacing w:before="240" w:after="0"/>
+      </w:pPr>
+    </w:p>
+    <w:p>
+      <w:pPr>
+        <w:spacing w:before="320" w:after="160"/>
+        <w:shd w:val="clear" w:color="auto" w:fill="E8F0FE"/>
+      </w:pPr>
+      <w:r>
+        <w:rPr>
+          <w:b/>
+          <w:i w:val="0"/>
+          <w:color w:val="1B3A6B"/>
+          <w:sz w:val="22"/>
+        </w:rPr>
+        <w:t xml:space="preserve">  Connect Google Analytics (Track Visitors)  </w:t>
+      </w:r>
+    </w:p>
+    <w:p>
+      <w:pPr>
+        <w:spacing w:before="200" w:after="60"/>
+      </w:pPr>
+      <w:r>
+        <w:rPr>
+          <w:b/>
+          <w:i w:val="0"/>
+          <w:color w:val="1B3A6B"/>
+          <w:sz w:val="24"/>
+        </w:rPr>
+        <w:t xml:space="preserve">Step G1  </w:t>
+      </w:r>
+      <w:r>
+        <w:rPr>
+          <w:b/>
+          <w:i w:val="0"/>
+          <w:color w:val="C8963E"/>
+          <w:sz w:val="18"/>
+        </w:rPr>
+        <w:t xml:space="preserve">[Web]  </w:t>
+      </w:r>
+      <w:r>
+        <w:rPr>
+          <w:b/>
+          <w:i w:val="0"/>
+          <w:color w:val="1B3A6B"/>
+          <w:sz w:val="24"/>
+        </w:rPr>
+        <w:t>Create a Google Analytics Account</w:t>
+      </w:r>
+    </w:p>
+    <w:p>
+      <w:pPr>
+        <w:spacing w:before="40" w:after="100"/>
+        <w:ind w:left="432"/>
+      </w:pPr>
+      <w:r>
+        <w:rPr>
+          <w:color w:val="1A1A2E"/>
+          <w:sz w:val="21"/>
+        </w:rPr>
+        <w:t>Go to analytics.google.com and sign in with your Google account. Click Start measuring and follow the setup wizard. When asked for a website URL, enter your GitHub Pages URL or custom domain. Google will give you a Measurement ID that looks like  G-XXXXXXXXXX.</w:t>
+      </w:r>
+    </w:p>
+    <w:p>
+      <w:pPr>
+        <w:spacing w:after="80"/>
+        <w:ind w:left="432"/>
+      </w:pPr>
+      <w:r>
+        <w:rPr>
+          <w:b/>
+          <w:i w:val="0"/>
+          <w:color w:val="C8963E"/>
+          <w:sz w:val="20"/>
+        </w:rPr>
+        <w:t xml:space="preserve">→ analytics.google.com: </w:t>
+      </w:r>
+      <w:r>
+        <w:rPr>
+          <w:b w:val="0"/>
+          <w:i/>
+          <w:color w:val="1B3A6B"/>
+          <w:sz w:val="20"/>
+        </w:rPr>
+        <w:t>https://analytics.google.com</w:t>
+      </w:r>
+    </w:p>
+    <w:p>
+      <w:pPr>
+        <w:spacing w:before="60" w:after="60"/>
+      </w:pPr>
+      <w:r>
+        <w:rPr>
+          <w:color w:val="D1D5DB"/>
+          <w:sz w:val="14"/>
+        </w:rPr>
+        <w:t>──────────────────────────────────────────────────────────────────────────</w:t>
+      </w:r>
+    </w:p>
+    <w:p>
+      <w:pPr>
+        <w:spacing w:before="200" w:after="60"/>
+      </w:pPr>
+      <w:r>
+        <w:rPr>
+          <w:b/>
+          <w:i w:val="0"/>
+          <w:color w:val="1B3A6B"/>
+          <w:sz w:val="24"/>
+        </w:rPr>
+        <w:t xml:space="preserve">Step G2  </w:t>
+      </w:r>
+      <w:r>
+        <w:rPr>
+          <w:b/>
+          <w:i w:val="0"/>
+          <w:color w:val="C8963E"/>
+          <w:sz w:val="18"/>
+        </w:rPr>
+        <w:t xml:space="preserve">[IDE]  </w:t>
+      </w:r>
+      <w:r>
+        <w:rPr>
+          <w:b/>
+          <w:i w:val="0"/>
+          <w:color w:val="1B3A6B"/>
+          <w:sz w:val="24"/>
+        </w:rPr>
+        <w:t>Add the Tracking Code</w:t>
+      </w:r>
+    </w:p>
+    <w:p>
+      <w:pPr>
+        <w:spacing w:before="40" w:after="100"/>
+        <w:ind w:left="432"/>
+      </w:pPr>
+      <w:r>
+        <w:rPr>
+          <w:color w:val="1A1A2E"/>
+          <w:sz w:val="21"/>
+        </w:rPr>
+        <w:t>In Claude Code, type:</w:t>
+      </w:r>
+    </w:p>
+    <w:p>
+      <w:pPr>
+        <w:ind w:left="576"/>
+      </w:pPr>
+      <w:r>
+        <w:rPr>
+          <w:i/>
+          <w:color w:val="6B7280"/>
+          <w:sz w:val="20"/>
+        </w:rPr>
+        <w:t>"Add a Google Analytics tracking script to the site. My Measurement ID is G-XXXXXXXXXX."</w:t>
+      </w:r>
+    </w:p>
+    <w:p>
+      <w:pPr>
+        <w:spacing w:before="40" w:after="100"/>
+        <w:ind w:left="432"/>
+      </w:pPr>
+      <w:r>
+        <w:rPr>
+          <w:color w:val="1A1A2E"/>
+          <w:sz w:val="21"/>
+        </w:rPr>
+        <w:t>Claude Code will add the correct script tag to your HTML automatically. Re-upload the file to GitHub. Within 24 hours you'll start seeing visitor data in your Google Analytics dashboard.</w:t>
+      </w:r>
+    </w:p>
+    <w:p>
       <w:r>
         <w:br w:type="page"/>
       </w:r>
     </w:p>
     <w:p>
       <w:pPr>
-        <w:spacing w:before="280" w:after="200"/>
+        <w:spacing w:before="240" w:after="200"/>
         <w:shd w:val="clear" w:color="auto" w:fill="1B3A6B"/>
       </w:pPr>
       <w:r>
         <w:rPr>
           <w:b/>
+          <w:i w:val="0"/>
           <w:color w:val="FFFFFF"/>
           <w:sz w:val="26"/>
         </w:rPr>
@@ -1630,6 +2939,11 @@
     </w:p>
     <w:p>
       <w:pPr>
+        <w:spacing w:before="80" w:after="0"/>
+      </w:pPr>
+    </w:p>
+    <w:p>
+      <w:pPr>
         <w:spacing w:before="60" w:after="60"/>
       </w:pPr>
       <w:r>
@@ -1639,7 +2953,7 @@
           <w:color w:val="1B3A6B"/>
           <w:sz w:val="21"/>
         </w:rPr>
-        <w:t xml:space="preserve">Claude Pro subscription             </w:t>
+        <w:t xml:space="preserve">Claude Pro ($20/month)                  </w:t>
       </w:r>
       <w:r>
         <w:rPr>
@@ -1662,7 +2976,7 @@
           <w:color w:val="1B3A6B"/>
           <w:sz w:val="21"/>
         </w:rPr>
-        <w:t xml:space="preserve">Claude Desktop download             </w:t>
+        <w:t xml:space="preserve">Claude Desktop (download)               </w:t>
       </w:r>
       <w:r>
         <w:rPr>
@@ -1685,7 +2999,7 @@
           <w:color w:val="1B3A6B"/>
           <w:sz w:val="21"/>
         </w:rPr>
-        <w:t xml:space="preserve">Cursor IDE download                 </w:t>
+        <w:t xml:space="preserve">Cursor IDE (free download)              </w:t>
       </w:r>
       <w:r>
         <w:rPr>
@@ -1708,7 +3022,7 @@
           <w:color w:val="1B3A6B"/>
           <w:sz w:val="21"/>
         </w:rPr>
-        <w:t xml:space="preserve">GitHub (file hosting)               </w:t>
+        <w:t xml:space="preserve">GitHub (free hosting)                   </w:t>
       </w:r>
       <w:r>
         <w:rPr>
@@ -1731,7 +3045,7 @@
           <w:color w:val="1B3A6B"/>
           <w:sz w:val="21"/>
         </w:rPr>
-        <w:t xml:space="preserve">Netlify Drop (instant deploy)       </w:t>
+        <w:t xml:space="preserve">Namecheap (domains ~$11/yr)             </w:t>
       </w:r>
       <w:r>
         <w:rPr>
@@ -1740,7 +3054,7 @@
           <w:color w:val="6B7280"/>
           <w:sz w:val="20"/>
         </w:rPr>
-        <w:t xml:space="preserve">  app.netlify.com/drop</w:t>
+        <w:t xml:space="preserve">  namecheap.com</w:t>
       </w:r>
     </w:p>
     <w:p>
@@ -1754,7 +3068,30 @@
           <w:color w:val="1B3A6B"/>
           <w:sz w:val="21"/>
         </w:rPr>
-        <w:t xml:space="preserve">Formspree (form emails)             </w:t>
+        <w:t xml:space="preserve">Cloudflare Registrar (~$10/yr)          </w:t>
+      </w:r>
+      <w:r>
+        <w:rPr>
+          <w:b w:val="0"/>
+          <w:i/>
+          <w:color w:val="6B7280"/>
+          <w:sz w:val="20"/>
+        </w:rPr>
+        <w:t xml:space="preserve">  cloudflare.com</w:t>
+      </w:r>
+    </w:p>
+    <w:p>
+      <w:pPr>
+        <w:spacing w:before="60" w:after="60"/>
+      </w:pPr>
+      <w:r>
+        <w:rPr>
+          <w:b/>
+          <w:i w:val="0"/>
+          <w:color w:val="1B3A6B"/>
+          <w:sz w:val="21"/>
+        </w:rPr>
+        <w:t xml:space="preserve">Formspree (form emails, free tier)      </w:t>
       </w:r>
       <w:r>
         <w:rPr>
@@ -1777,7 +3114,7 @@
           <w:color w:val="1B3A6B"/>
           <w:sz w:val="21"/>
         </w:rPr>
-        <w:t xml:space="preserve">Namecheap (domains)                 </w:t>
+        <w:t xml:space="preserve">Google Analytics (free)                 </w:t>
       </w:r>
       <w:r>
         <w:rPr>
@@ -1786,19 +3123,111 @@
           <w:color w:val="6B7280"/>
           <w:sz w:val="20"/>
         </w:rPr>
-        <w:t xml:space="preserve">  namecheap.com</w:t>
+        <w:t xml:space="preserve">  analytics.google.com</w:t>
       </w:r>
     </w:p>
     <w:p>
       <w:pPr>
-        <w:spacing w:before="80" w:after="80"/>
+        <w:spacing w:before="60" w:after="60"/>
+      </w:pPr>
+      <w:r>
+        <w:rPr>
+          <w:b/>
+          <w:i w:val="0"/>
+          <w:color w:val="1B3A6B"/>
+          <w:sz w:val="21"/>
+        </w:rPr>
+        <w:t xml:space="preserve">GitHub Pages IP: 185.199.108.153        </w:t>
+      </w:r>
+      <w:r>
+        <w:rPr>
+          <w:b w:val="0"/>
+          <w:i/>
+          <w:color w:val="6B7280"/>
+          <w:sz w:val="20"/>
+        </w:rPr>
+        <w:t xml:space="preserve">  Add as A record in DNS</w:t>
+      </w:r>
+    </w:p>
+    <w:p>
+      <w:pPr>
+        <w:spacing w:before="60" w:after="60"/>
+      </w:pPr>
+      <w:r>
+        <w:rPr>
+          <w:b/>
+          <w:i w:val="0"/>
+          <w:color w:val="1B3A6B"/>
+          <w:sz w:val="21"/>
+        </w:rPr>
+        <w:t xml:space="preserve">GitHub Pages IP: 185.199.109.153        </w:t>
+      </w:r>
+      <w:r>
+        <w:rPr>
+          <w:b w:val="0"/>
+          <w:i/>
+          <w:color w:val="6B7280"/>
+          <w:sz w:val="20"/>
+        </w:rPr>
+        <w:t xml:space="preserve">  Add as A record in DNS</w:t>
+      </w:r>
+    </w:p>
+    <w:p>
+      <w:pPr>
+        <w:spacing w:before="60" w:after="60"/>
+      </w:pPr>
+      <w:r>
+        <w:rPr>
+          <w:b/>
+          <w:i w:val="0"/>
+          <w:color w:val="1B3A6B"/>
+          <w:sz w:val="21"/>
+        </w:rPr>
+        <w:t xml:space="preserve">GitHub Pages IP: 185.199.110.153        </w:t>
+      </w:r>
+      <w:r>
+        <w:rPr>
+          <w:b w:val="0"/>
+          <w:i/>
+          <w:color w:val="6B7280"/>
+          <w:sz w:val="20"/>
+        </w:rPr>
+        <w:t xml:space="preserve">  Add as A record in DNS</w:t>
+      </w:r>
+    </w:p>
+    <w:p>
+      <w:pPr>
+        <w:spacing w:before="60" w:after="60"/>
+      </w:pPr>
+      <w:r>
+        <w:rPr>
+          <w:b/>
+          <w:i w:val="0"/>
+          <w:color w:val="1B3A6B"/>
+          <w:sz w:val="21"/>
+        </w:rPr>
+        <w:t xml:space="preserve">GitHub Pages IP: 185.199.111.153        </w:t>
+      </w:r>
+      <w:r>
+        <w:rPr>
+          <w:b w:val="0"/>
+          <w:i/>
+          <w:color w:val="6B7280"/>
+          <w:sz w:val="20"/>
+        </w:rPr>
+        <w:t xml:space="preserve">  Add as A record in DNS</w:t>
+      </w:r>
+    </w:p>
+    <w:p>
+      <w:pPr>
+        <w:spacing w:before="60" w:after="60"/>
       </w:pPr>
       <w:r>
         <w:rPr>
           <w:color w:val="D1D5DB"/>
-          <w:sz w:val="16"/>
+          <w:sz w:val="14"/>
         </w:rPr>
-        <w:t>────────────────────────────────────────────────────────────────────────</w:t>
+        <w:t>──────────────────────────────────────────────────────────────────────────</w:t>
       </w:r>
     </w:p>
     <w:p>

</xml_diff>